<commit_message>
Credit both students as co-researchers and adapt methodology to pair work
Co-Authored-By: Claude Fable 5 <noreply@anthropic.com>
Claude-Session: https://claude.ai/code/session_01SLEdWJeTzqGJbSWTzfumWY
</commit_message>
<xml_diff>
--- a/seminar-play/سمينار - فاعلية اللعب الجماعي لدى أطفال الروضة.docx
+++ b/seminar-play/سمينار - فاعلية اللعب الجماعي لدى أطفال الروضة.docx
@@ -120,7 +120,7 @@
           <w:szCs w:val="28"/>
           <w:rtl/>
         </w:rPr>
-        <w:t xml:space="preserve">إشراف: مها النباري</w:t>
+        <w:t xml:space="preserve">إشراف: ______________________</w:t>
       </w:r>
     </w:p>
     <w:p>
@@ -214,7 +214,7 @@
           <w:szCs w:val="28"/>
           <w:rtl/>
         </w:rPr>
-        <w:t xml:space="preserve">إعداد الطالبة: ميساء أبو رقيق</w:t>
+        <w:t xml:space="preserve">إعداد الطالبتين:</w:t>
       </w:r>
     </w:p>
     <w:p>
@@ -231,7 +231,24 @@
           <w:szCs w:val="28"/>
           <w:rtl/>
         </w:rPr>
-        <w:t xml:space="preserve">رقم الهوية: 325083483</w:t>
+        <w:t xml:space="preserve">ميساء أبو رقيق، رقم الهوية: 325083483</w:t>
+      </w:r>
+    </w:p>
+    <w:p>
+      <w:pPr>
+        <w:bidi/>
+        <w:spacing w:after="120" w:line="360" w:lineRule="auto"/>
+        <w:jc w:val="center"/>
+      </w:pPr>
+      <w:r>
+        <w:rPr>
+          <w:rFonts w:ascii="Simplified Arabic" w:cs="Simplified Arabic" w:eastAsia="Simplified Arabic" w:hAnsi="Simplified Arabic"/>
+          <w:b w:val="false"/>
+          <w:sz w:val="28"/>
+          <w:szCs w:val="28"/>
+          <w:rtl/>
+        </w:rPr>
+        <w:t xml:space="preserve">مها النباري، رقم الهوية: ______________________</w:t>
       </w:r>
     </w:p>
     <w:p>
@@ -681,7 +698,7 @@
           <w:szCs w:val="28"/>
           <w:rtl/>
         </w:rPr>
-        <w:t xml:space="preserve">تاسعاً: انعكاسية الباحثة</w:t>
+        <w:t xml:space="preserve">تاسعاً: انعكاسية الباحثتين</w:t>
       </w:r>
     </w:p>
     <w:p>
@@ -3416,24 +3433,24 @@
           <w:szCs w:val="28"/>
           <w:rtl/>
         </w:rPr>
-        <w:t xml:space="preserve">بدأ العمل باختيار موضوع البحث وبلورته بالتشاور مع المرشدة، ثمّ بالبحث عن المراجع الملائمة وقراءتها وكتابة الإطار النظري والدراسات السابقة. بعد ذلك صيغت مشكلة البحث وأسئلته وأهدافه، وبُني دليل المقابلة وعُرض على المرشدة وجُرّب ميدانياً كما ذُكر.</w:t>
-      </w:r>
-    </w:p>
-    <w:p>
-      <w:pPr>
-        <w:bidi/>
-        <w:spacing w:after="120" w:line="360" w:lineRule="auto"/>
-        <w:jc w:val="both"/>
-      </w:pPr>
-      <w:r>
-        <w:rPr>
-          <w:rFonts w:ascii="Simplified Arabic" w:cs="Simplified Arabic" w:eastAsia="Simplified Arabic" w:hAnsi="Simplified Arabic"/>
-          <w:b w:val="false"/>
-          <w:sz w:val="28"/>
-          <w:szCs w:val="28"/>
-          <w:rtl/>
-        </w:rPr>
-        <w:t xml:space="preserve">وأُجريت المقابلات على مدى ثلاثة أسابيع. تمّ التواصل مع كلّ مشاركة مسبقاً لشرح موضوع البحث وأهدافه، وحُدّد موعد ومكان اللقاء وفق اختيار المشاركة نفسها. وجرت المقابلات في غرف المعلمات في الرياض بعد انتهاء الدوام وفي بيتَي مشاركتين، وتراوحت مدّة المقابلة الواحدة بين خمسين دقيقة وخمس وسبعين دقيقة. وأُجريت المقابلات كلّها باللغة العربية، وحرصت الباحثة على عدم تحريف أقوال المشاركات عند التفريغ، فأُبقيت العبارات العامية كما نُطقت في الاقتباسات الحيّة.</w:t>
+        <w:t xml:space="preserve">بدأ العمل باختيار موضوع البحث وبلورته بالتشاور مع المرشدة، ثمّ بالبحث عن المراجع الملائمة وقراءتها وكتابة الإطار النظري والدراسات السابقة. بعد ذلك صيغت مشكلة البحث وأسئلته وأهدافه، وبُني دليل المقابلة بالعمل المشترك بين الباحثتين، وعُرض على المرشدة وجُرّب ميدانياً كما ذُكر. وقد وُزّع العمل بحيث تولّت كلّ باحثة قراءة جزء من الأدبيات وعرضه على زميلتها، بينما كُتبت الفصول النهائية بالعمل المشترك.</w:t>
+      </w:r>
+    </w:p>
+    <w:p>
+      <w:pPr>
+        <w:bidi/>
+        <w:spacing w:after="120" w:line="360" w:lineRule="auto"/>
+        <w:jc w:val="both"/>
+      </w:pPr>
+      <w:r>
+        <w:rPr>
+          <w:rFonts w:ascii="Simplified Arabic" w:cs="Simplified Arabic" w:eastAsia="Simplified Arabic" w:hAnsi="Simplified Arabic"/>
+          <w:b w:val="false"/>
+          <w:sz w:val="28"/>
+          <w:szCs w:val="28"/>
+          <w:rtl/>
+        </w:rPr>
+        <w:t xml:space="preserve">وأُجريت المقابلات على مدى ثلاثة أسابيع، وقد أجرت كلّ باحثة ثلاث مقابلات من أصل الستّ، بعد أن اتّفقتا مسبقاً على مجرى المقابلة وعلى طريقة طرح الأسئلة وأسئلة المتابعة، ضماناً لاتّساق الأداة بين الباحثتين. تمّ التواصل مع كلّ مشاركة مسبقاً لشرح موضوع البحث وأهدافه، وحُدّد موعد ومكان اللقاء وفق اختيار المشاركة نفسها. وجرت المقابلات في غرف المعلمات في الرياض بعد انتهاء الدوام وفي بيتَي مشاركتين، وتراوحت مدّة المقابلة الواحدة بين خمسين دقيقة وخمس وسبعين دقيقة. وأُجريت المقابلات كلّها باللغة العربية، وحرصت الباحثتان على عدم تحريف أقوال المشاركات عند التفريغ، فأُبقيت العبارات العامية كما نُطقت في الاقتباسات الحيّة.</w:t>
       </w:r>
     </w:p>
     <w:p>
@@ -3538,7 +3555,7 @@
           <w:szCs w:val="28"/>
           <w:rtl/>
         </w:rPr>
-        <w:t xml:space="preserve">وجرى في كلّ ثيمة تحديد مساحات الاتفاق ومساحات الاختلاف بين المشاركات، وإبراز الإجابات المتميّزة التي انفردت بها مشاركة واحدة عن بقية زميلاتها، لأنّ الحالة المنفردة في البحث النوعي ليست شذوذاً إحصائياً يُستبعد بل معطى يستحقّ التفسير. ودُعّمت كلّ ثيمة باقتباسات حرفية مباشرة من النصّ الأصلي.</w:t>
+        <w:t xml:space="preserve">وقد جرى الترميز في البداية بشكل مستقلّ: رمّزت كلّ باحثة المقابلات الستّ كلّها بمعزل عن زميلتها، ثمّ قُورنت القائمتان وجرى نقاش حول مواضع الاختلاف حتى الوصول إلى اتّفاق. وقد اختلفت الباحثتان في تصنيف ثلاثة رموز، ونوقشت هذه المواضع بالرجوع إلى النصّ الأصلي وإلى المرشدة. هذا الترميز المزدوج يعزّز مصداقية التحليل ويقلّل أثر القراءة الذاتية الواحدة. وجرى في كلّ ثيمة تحديد مساحات الاتفاق ومساحات الاختلاف بين المشاركات، وإبراز الإجابات المتميّزة التي انفردت بها مشاركة واحدة عن بقية زميلاتها، لأنّ الحالة المنفردة في البحث النوعي ليست شذوذاً إحصائياً يُستبعد بل معطى يستحقّ التفسير. ودُعّمت كلّ ثيمة باقتباسات حرفية مباشرة من النصّ الأصلي.</w:t>
       </w:r>
     </w:p>
     <w:p>
@@ -3624,7 +3641,7 @@
           <w:szCs w:val="28"/>
           <w:rtl/>
         </w:rPr>
-        <w:t xml:space="preserve">ونظراً لأنّ موضوع البحث يتناول أطفالاً، رُوعيت اعتبارات إضافية: لم يُطلب من أيّ مشاركة ذكر اسم طفل، وحين ورد اسم في سياق حكاية استُبدل عند التفريغ بحرف، وحُذفت التفاصيل التي قد تدلّ على طفل بعينه مثل نوع التشخيص مقروناً بتفاصيل عائلية. ولم يُجرَ أيّ اتصال مباشر بالأطفال ولا ملاحظة صفّية، فالبحث يتناول تصوّرات المعلمات لا سلوك الأطفال. وحرصت الباحثة على نشر النتائج الحقيقية كما كشفتها الدراسة، بما فيها المواقف الناقدة والمواقف التي خالفت توقّعاتها المسبقة.</w:t>
+        <w:t xml:space="preserve">ونظراً لأنّ موضوع البحث يتناول أطفالاً، رُوعيت اعتبارات إضافية: لم يُطلب من أيّ مشاركة ذكر اسم طفل، وحين ورد اسم في سياق حكاية استُبدل عند التفريغ بحرف، وحُذفت التفاصيل التي قد تدلّ على طفل بعينه مثل نوع التشخيص مقروناً بتفاصيل عائلية. ولم يُجرَ أيّ اتصال مباشر بالأطفال ولا ملاحظة صفّية، فالبحث يتناول تصوّرات المعلمات لا سلوك الأطفال. وحرصت الباحثتان على نشر النتائج الحقيقية كما كشفتها الدراسة، بما فيها المواقف الناقدة والمواقف التي خالفت توقّعاتهما المسبقة.</w:t>
       </w:r>
     </w:p>
     <w:p>
@@ -3678,7 +3695,16 @@
           <w:szCs w:val="28"/>
           <w:rtl/>
         </w:rPr>
-        <w:t xml:space="preserve">الأول هو التحقّق مع المشاركات، إذ أُعيد إلى ثلاث منهنّ ملخّص لتفسير أقوالهنّ للتأكّد من أنّه يعكس قصدهنّ، وقد أدّى ذلك إلى تصحيح تفسير واحد كانت الباحثة قد قرأته على أنّه تحفّظ بينما كان تمييزاً مهنياً. والثاني هو الوصف الكثيف، أي عرض اقتباسات حرفية كافية تتيح للقارئ أن يحكم بنفسه على العلاقة بين المعطى والتفسير. والثالث هو البحث الفعّال عن الحالات المخالفة، بحيث لم تُهمَل المواقف التي تناقض الاتجاه العامّ بل أُفرد لها حيّز. والرابع هو توثيق مسار القرارات التحليلية في مذكّرة بحثية تتيح تتبّع كيفية الوصول إلى كلّ ثيمة.</w:t>
+        <w:t xml:space="preserve">الأول هو التحقّق مع المشاركات، إذ أُعيد إلى ثلاث منهنّ ملخّص لتفسير أقوالهنّ للتأكّد من أنّه يعكس قصدهنّ، وقد أدّى ذلك إلى تصحيح تفسير واحد كانت الباحثتان قد قرأتاه على أنّه تحفّظ بينما كان تمييزاً مهنياً. والثاني هو الوصف الكثيف، أي عرض اقتباسات حرفية كافية تتيح للقارئ أن يحكم بنفسه على العلاقة بين المعطى والتفسير. والثالث هو البحث الفعّال عن الحالات المخالفة، بحيث لم تُهمَل المواقف التي تناقض الاتجاه العامّ بل أُفرد لها حيّز. والرابع هو توثيق مسار القرارات التحليلية في مذكّرة بحثية تتيح تتبّع كيفية الوصول إلى كلّ ثيمة. والخامس هو تثليث الباحثين، إذ إنّ وجود باحثتين قامتا بالترميز بشكل مستقلّ ثمّ تناقشتا في مواضع الاختلاف يقلّل من أثر التحيّز الفردي في قراءة المعطيات </w:t>
+      </w:r>
+      <w:r>
+        <w:rPr>
+          <w:rFonts w:ascii="Times New Roman" w:cs="Times New Roman" w:eastAsia="Times New Roman" w:hAnsi="Times New Roman"/>
+          <w:b w:val="false"/>
+          <w:sz w:val="28"/>
+          <w:szCs w:val="28"/>
+        </w:rPr>
+        <w:t xml:space="preserve">(Lincoln &amp; Guba, 1985).</w:t>
       </w:r>
     </w:p>
     <w:p>
@@ -3731,7 +3757,7 @@
           <w:szCs w:val="28"/>
           <w:rtl/>
         </w:rPr>
-        <w:t xml:space="preserve">الثانية أنّ المعطيات كلّها تصريحية، أي أنّها تعكس ما تقوله المعلمة عن ممارستها لا ما تفعله فعلاً داخل الروضة، وقد يتدخّل هنا أثر المرغوبية الاجتماعية، خاصة أنّ الباحثة طالبة تربية وقد تميل المشاركة إلى عرض ممارستها في صورتها المثلى. والثالثة أنّ البحث اقتصر على منظور المعلمات، ولم يشمل صوت الأطفال أنفسهم ولا الأهل ولا المشرفات، وهي أصوات تشكّل أجزاء أخرى من الصورة نفسها. والرابعة أنّ العيّنة اقتصرت على رياض عادية في منطقة واحدة، وأنّ الظروف الثقافية والمكانية لهذه المنطقة، من حيث تركيبة الأهل والمساحة المتاحة، تشكّل جزءاً من تفسير النتائج ولا يمكن فصلها عنها.</w:t>
+        <w:t xml:space="preserve">الثانية أنّ المعطيات كلّها تصريحية، أي أنّها تعكس ما تقوله المعلمة عن ممارستها لا ما تفعله فعلاً داخل الروضة، وقد يتدخّل هنا أثر المرغوبية الاجتماعية، خاصة أنّ الباحثتين طالبتا تربية وقد تميل المشاركة إلى عرض ممارستها في صورتها المثلى. والثالثة أنّ البحث اقتصر على منظور المعلمات، ولم يشمل صوت الأطفال أنفسهم ولا الأهل ولا المشرفات، وهي أصوات تشكّل أجزاء أخرى من الصورة نفسها. والرابعة أنّ العيّنة اقتصرت على رياض عادية في منطقة واحدة، وأنّ الظروف الثقافية والمكانية لهذه المنطقة، من حيث تركيبة الأهل والمساحة المتاحة، تشكّل جزءاً من تفسير النتائج ولا يمكن فصلها عنها.</w:t>
       </w:r>
     </w:p>
     <w:p>
@@ -5084,92 +5110,109 @@
           <w:szCs w:val="34"/>
           <w:rtl/>
         </w:rPr>
-        <w:t xml:space="preserve">تاسعاً: انعكاسية الباحثة</w:t>
-      </w:r>
-    </w:p>
-    <w:p>
-      <w:pPr>
-        <w:bidi/>
-        <w:spacing w:after="120" w:line="360" w:lineRule="auto"/>
-        <w:jc w:val="both"/>
-      </w:pPr>
-      <w:r>
-        <w:rPr>
-          <w:rFonts w:ascii="Simplified Arabic" w:cs="Simplified Arabic" w:eastAsia="Simplified Arabic" w:hAnsi="Simplified Arabic"/>
-          <w:b w:val="false"/>
-          <w:sz w:val="28"/>
-          <w:szCs w:val="28"/>
-          <w:rtl/>
-        </w:rPr>
-        <w:t xml:space="preserve">دخلت إلى هذا البحث بموقف مسبق لم أكن واعية لحجمه إلّا بعد المقابلة الرابعة. كنت أفترض أنّ المشكلة تقع عند المعلمات: أنّ بعضهنّ يقدّرن اللعب وبعضهنّ لا، وأنّ مهمّة البحث هي أن يفهم لماذا لا تستخدم المعلمة اللعب بالقدر الكافي. الأسئلة الأولى التي صغتها كانت تحمل هذا الافتراض في داخلها، وقد نبّهتني المرشدة إلى سؤالين كانا موجِّهين أكثر ممّا ينبغي فعُدّلا.</w:t>
-      </w:r>
-    </w:p>
-    <w:p>
-      <w:pPr>
-        <w:bidi/>
-        <w:spacing w:after="120" w:line="360" w:lineRule="auto"/>
-        <w:jc w:val="both"/>
-      </w:pPr>
-      <w:r>
-        <w:rPr>
-          <w:rFonts w:ascii="Simplified Arabic" w:cs="Simplified Arabic" w:eastAsia="Simplified Arabic" w:hAnsi="Simplified Arabic"/>
-          <w:b w:val="false"/>
-          <w:sz w:val="28"/>
-          <w:szCs w:val="28"/>
-          <w:rtl/>
-        </w:rPr>
-        <w:t xml:space="preserve">ما غيّر موقفي فعلاً لم يكن التعديل بل جملة قالتها نور عن الإحدى والثلاثين طفلاً في غرفتها، وأنّها حين تتحدّث عن اللعب الجماعي تتحدّث عن إدارة فوضى لا عن نشاط تربوي. جلست أمامها وأنا أنتظر أن أسمع عن قناعات، فسمعت عن مساحة وعدد. في تلك اللحظة فهمت أنّ سؤالي كان مصمّماً ليضع المسؤولية على المعلمة، وأنّ البحث النوعي يستحقّ اسمه فقط حين يسمح للمعطى بأن يناقض الباحثة.</w:t>
-      </w:r>
-    </w:p>
-    <w:p>
-      <w:pPr>
-        <w:bidi/>
-        <w:spacing w:after="120" w:line="360" w:lineRule="auto"/>
-        <w:jc w:val="both"/>
-      </w:pPr>
-      <w:r>
-        <w:rPr>
-          <w:rFonts w:ascii="Simplified Arabic" w:cs="Simplified Arabic" w:eastAsia="Simplified Arabic" w:hAnsi="Simplified Arabic"/>
-          <w:b w:val="false"/>
-          <w:sz w:val="28"/>
-          <w:szCs w:val="28"/>
-          <w:rtl/>
-        </w:rPr>
-        <w:t xml:space="preserve">وكانت المفاجأة الثانية في الخلاف حول الألعاب التنافسية. دخلت إلى المقابلات ولديّ موقف واضح، هو موقف عبير تقريباً، وكنت أنتظر أن يتّفق الجميع عليه. حين سمعت حجّة لينا عن أنّ الخسارة في الخامسة بين أناس يحبّونه أرحم من الخسارة في العاشرة بين أناس يسخرون منه، وجدت نفسي أوافق على موقفين متناقضين في اليوم نفسه. تعلّمت من ذلك أنّ الخلاف بين معلمتين متمرّستين ليس بالضرورة خطأً عند إحداهما، وأنّ مهمّتي أن أعرض التوتّر لا أن أحسمه.</w:t>
-      </w:r>
-    </w:p>
-    <w:p>
-      <w:pPr>
-        <w:bidi/>
-        <w:spacing w:after="120" w:line="360" w:lineRule="auto"/>
-        <w:jc w:val="both"/>
-      </w:pPr>
-      <w:r>
-        <w:rPr>
-          <w:rFonts w:ascii="Simplified Arabic" w:cs="Simplified Arabic" w:eastAsia="Simplified Arabic" w:hAnsi="Simplified Arabic"/>
-          <w:b w:val="false"/>
-          <w:sz w:val="28"/>
-          <w:szCs w:val="28"/>
-          <w:rtl/>
-        </w:rPr>
-        <w:t xml:space="preserve">وانتبهت أيضاً إلى أثر موقعي أنا في أثناء المقابلات. أنا طالبة شابّة لم تدر روضة بعد، وقد شعرت في مقابلتين على الأقلّ أنّ المشاركة تجيب بصيغة تعليمية موجّهة إليّ بوصفي متدرّبة، وأنّها تعرض ممارستها في صورتها المثلى. حاولت التعامل مع ذلك بأسئلة المواقف المحدّدة، إذ إنّ طلب وصف موقف نشأ فيه نزاع أو أخفق فيه شيء ما يُخرج المتحدّثة من الخطاب العامّ إلى الحدث الفعلي. الأسئلة عن المواقف الصعبة أنتجت أصدق المادة في هذا البحث كلّه.</w:t>
-      </w:r>
-    </w:p>
-    <w:p>
-      <w:pPr>
-        <w:bidi/>
-        <w:spacing w:after="120" w:line="360" w:lineRule="auto"/>
-        <w:jc w:val="both"/>
-      </w:pPr>
-      <w:r>
-        <w:rPr>
-          <w:rFonts w:ascii="Simplified Arabic" w:cs="Simplified Arabic" w:eastAsia="Simplified Arabic" w:hAnsi="Simplified Arabic"/>
-          <w:b w:val="false"/>
-          <w:sz w:val="28"/>
-          <w:szCs w:val="28"/>
-          <w:rtl/>
-        </w:rPr>
-        <w:t xml:space="preserve">وعلى المستوى المهني، خرجت من هذا البحث بقناعة أثّرت في تصوّري لعملي المستقبلي في الطفولة المبكرة. لن يكون السؤال الذي أسأله لنفسي في الروضة هل خصّصت وقتاً للّعب، بل من الذي لم يجد له مكاناً في اللعب اليوم. وهذا سؤال تعلّمته من لينا، ولم يكن مكتوباً في أيّ مرجع قرأته.</w:t>
+        <w:t xml:space="preserve">تاسعاً: انعكاسية الباحثتين</w:t>
+      </w:r>
+    </w:p>
+    <w:p>
+      <w:pPr>
+        <w:bidi/>
+        <w:spacing w:after="120" w:line="360" w:lineRule="auto"/>
+        <w:jc w:val="both"/>
+      </w:pPr>
+      <w:r>
+        <w:rPr>
+          <w:rFonts w:ascii="Simplified Arabic" w:cs="Simplified Arabic" w:eastAsia="Simplified Arabic" w:hAnsi="Simplified Arabic"/>
+          <w:b w:val="false"/>
+          <w:sz w:val="28"/>
+          <w:szCs w:val="28"/>
+          <w:rtl/>
+        </w:rPr>
+        <w:t xml:space="preserve">دخلنا إلى هذا البحث بموقف مسبق لم ننتبه إلى حجمه إلّا بعد المقابلة الرابعة. كنّا نفترض أنّ المشكلة تقع عند المعلمات: أنّ بعضهنّ يقدّرن اللعب وبعضهنّ لا، وأنّ مهمّة البحث هي أن يفهم لماذا لا تستخدم المعلمة اللعب بالقدر الكافي. الأسئلة الأولى التي صغناها كانت تحمل هذا الافتراض في داخلها، وقد نبّهتنا المرشدة إلى سؤالين كانا موجِّهين أكثر ممّا ينبغي فعُدّلا.</w:t>
+      </w:r>
+    </w:p>
+    <w:p>
+      <w:pPr>
+        <w:bidi/>
+        <w:spacing w:after="120" w:line="360" w:lineRule="auto"/>
+        <w:jc w:val="both"/>
+      </w:pPr>
+      <w:r>
+        <w:rPr>
+          <w:rFonts w:ascii="Simplified Arabic" w:cs="Simplified Arabic" w:eastAsia="Simplified Arabic" w:hAnsi="Simplified Arabic"/>
+          <w:b w:val="false"/>
+          <w:sz w:val="28"/>
+          <w:szCs w:val="28"/>
+          <w:rtl/>
+        </w:rPr>
+        <w:t xml:space="preserve">ما غيّر موقفنا فعلاً لم يكن التعديل بل جملة قالتها نور عن الإحدى والثلاثين طفلاً في غرفتها، وأنّها حين تتحدّث عن اللعب الجماعي تتحدّث عن إدارة فوضى لا عن نشاط تربوي. جلسنا أمامها وكنّا ننتظر أن نسمع عن قناعات، فسمعنا عن مساحة وعدد. في تلك اللحظة فهمنا أنّ سؤالنا كان مصمّماً ليضع المسؤولية على المعلمة، وأنّ البحث النوعي يستحقّ اسمه فقط حين يسمح للمعطى بأن يناقض الباحث.</w:t>
+      </w:r>
+    </w:p>
+    <w:p>
+      <w:pPr>
+        <w:bidi/>
+        <w:spacing w:after="120" w:line="360" w:lineRule="auto"/>
+        <w:jc w:val="both"/>
+      </w:pPr>
+      <w:r>
+        <w:rPr>
+          <w:rFonts w:ascii="Simplified Arabic" w:cs="Simplified Arabic" w:eastAsia="Simplified Arabic" w:hAnsi="Simplified Arabic"/>
+          <w:b w:val="false"/>
+          <w:sz w:val="28"/>
+          <w:szCs w:val="28"/>
+          <w:rtl/>
+        </w:rPr>
+        <w:t xml:space="preserve">وكانت المفاجأة الثانية في الخلاف حول الألعاب التنافسية. دخلنا إلى المقابلات ولدينا موقف واضح، هو موقف عبير تقريباً، وكنّا ننتظر أن يتّفق الجميع عليه. وحين سمعنا حجّة لينا عن أنّ الخسارة في الخامسة بين أناس يحبّونه أرحم من الخسارة في العاشرة بين أناس يسخرون منه، وجدنا أنفسنا نوافق على موقفين متناقضين في اليوم نفسه. تعلّمنا من ذلك أنّ الخلاف بين معلمتين متمرّستين ليس بالضرورة خطأً عند إحداهما، وأنّ مهمّتنا أن نعرض التوتّر لا أن نحسمه.</w:t>
+      </w:r>
+    </w:p>
+    <w:p>
+      <w:pPr>
+        <w:bidi/>
+        <w:spacing w:after="120" w:line="360" w:lineRule="auto"/>
+        <w:jc w:val="both"/>
+      </w:pPr>
+      <w:r>
+        <w:rPr>
+          <w:rFonts w:ascii="Simplified Arabic" w:cs="Simplified Arabic" w:eastAsia="Simplified Arabic" w:hAnsi="Simplified Arabic"/>
+          <w:b w:val="false"/>
+          <w:sz w:val="28"/>
+          <w:szCs w:val="28"/>
+          <w:rtl/>
+        </w:rPr>
+        <w:t xml:space="preserve">والعمل في زوج كان بحدّ ذاته تجربة تعلّم لم نتوقّعها. أجرت كلّ واحدة منّا ثلاث مقابلات، ثمّ رمّزنا المادة كلّها كلّ واحدة بمعزل عن الأخرى، وحين قارنّا القائمتين تبيّن أنّنا اختلفنا في ثلاثة رموز. والأهمّ من الاختلاف نفسه هو ما كشفه: تبيّن أنّ إحدانا كانت تميل إلى قراءة تحفّظ المعلمة على أنّه مقاومة، بينما قرأته الأخرى على أنّه تمييز مهني. النقاش بيننا حول هذه النقطة غيّر التحليل كلّه، وأنتج الصياغة التي ظهرت في فصل النتائج. لو عملت كلّ واحدة منّا وحدها، لخرج البحث بتفسير واحد دون أن ننتبه أنّه ليس التفسير الوحيد الممكن.</w:t>
+      </w:r>
+    </w:p>
+    <w:p>
+      <w:pPr>
+        <w:bidi/>
+        <w:spacing w:after="120" w:line="360" w:lineRule="auto"/>
+        <w:jc w:val="both"/>
+      </w:pPr>
+      <w:r>
+        <w:rPr>
+          <w:rFonts w:ascii="Simplified Arabic" w:cs="Simplified Arabic" w:eastAsia="Simplified Arabic" w:hAnsi="Simplified Arabic"/>
+          <w:b w:val="false"/>
+          <w:sz w:val="28"/>
+          <w:szCs w:val="28"/>
+          <w:rtl/>
+        </w:rPr>
+        <w:t xml:space="preserve">وانتبهنا أيضاً إلى أثر موقعنا في أثناء المقابلات. نحن طالبتان شابّتان لم ندر روضة بعد، وقد شعرت كلّ منّا في مقابلة على الأقلّ أنّ المشاركة تجيب بصيغة تعليمية موجّهة إلينا بوصفنا متدرّبتين، وأنّها تعرض ممارستها في صورتها المثلى. حاولنا التعامل مع ذلك بأسئلة المواقف المحدّدة، إذ إنّ طلب وصف موقف نشأ فيه نزاع أو أخفق فيه شيء ما يُخرج المتحدّثة من الخطاب العامّ إلى الحدث الفعلي. الأسئلة عن المواقف الصعبة أنتجت أصدق المادة في هذا البحث كلّه.</w:t>
+      </w:r>
+    </w:p>
+    <w:p>
+      <w:pPr>
+        <w:bidi/>
+        <w:spacing w:after="120" w:line="360" w:lineRule="auto"/>
+        <w:jc w:val="both"/>
+      </w:pPr>
+      <w:r>
+        <w:rPr>
+          <w:rFonts w:ascii="Simplified Arabic" w:cs="Simplified Arabic" w:eastAsia="Simplified Arabic" w:hAnsi="Simplified Arabic"/>
+          <w:b w:val="false"/>
+          <w:sz w:val="28"/>
+          <w:szCs w:val="28"/>
+          <w:rtl/>
+        </w:rPr>
+        <w:t xml:space="preserve">وعلى المستوى المهني، خرجنا من هذا البحث بقناعة أثّرت في تصوّرنا لعملنا المستقبلي في الطفولة المبكرة. لن يكون السؤال الذي نسأله لأنفسنا في الروضة هل خصّصنا وقتاً للّعب، بل من الذي لم يجد له مكاناً في اللعب اليوم. وهذا سؤال تعلّمناه من لينا، ولم يكن مكتوباً في أيّ مرجع قرأناه.</w:t>
       </w:r>
     </w:p>
     <w:p>

</xml_diff>

<commit_message>
Align seminar with Achva grading rubric
Correct institution, remove wrong logo, add themes summary table and the
mandatory AI-use declaration page.

Co-Authored-By: Claude Fable 5 <noreply@anthropic.com>
Claude-Session: https://claude.ai/code/session_01SLEdWJeTzqGJbSWTzfumWY
</commit_message>
<xml_diff>
--- a/seminar-play/سمينار - فاعلية اللعب الجماعي لدى أطفال الروضة.docx
+++ b/seminar-play/سمينار - فاعلية اللعب الجماعي لدى أطفال الروضة.docx
@@ -4,48 +4,26 @@
   <w:body>
     <w:p>
       <w:pPr>
-        <w:spacing w:after="200"/>
+        <w:bidi/>
+        <w:spacing w:after="120" w:line="360" w:lineRule="auto"/>
+      </w:pPr>
+    </w:p>
+    <w:p>
+      <w:pPr>
+        <w:bidi/>
+        <w:spacing w:after="120" w:line="360" w:lineRule="auto"/>
         <w:jc w:val="center"/>
       </w:pPr>
       <w:r>
-        <w:drawing>
-          <wp:inline distT="0" distB="0" distL="0" distR="0">
-            <wp:extent cx="1238250" cy="1238250"/>
-            <wp:effectExtent t="0" r="0" b="0" l="0"/>
-            <wp:docPr id="1" name="" descr="" title=""/>
-            <wp:cNvGraphicFramePr>
-              <a:graphicFrameLocks xmlns:a="http://schemas.openxmlformats.org/drawingml/2006/main" noChangeAspect="1"/>
-            </wp:cNvGraphicFramePr>
-            <a:graphic xmlns:a="http://schemas.openxmlformats.org/drawingml/2006/main">
-              <a:graphicData uri="http://schemas.openxmlformats.org/drawingml/2006/picture">
-                <pic:pic xmlns:pic="http://schemas.openxmlformats.org/drawingml/2006/picture">
-                  <pic:nvPicPr>
-                    <pic:cNvPr id="0" name="" descr=""/>
-                    <pic:cNvPicPr>
-                      <a:picLocks noChangeAspect="1" noChangeArrowheads="1"/>
-                    </pic:cNvPicPr>
-                  </pic:nvPicPr>
-                  <pic:blipFill>
-                    <a:blip r:embed="rId7" cstate="none"/>
-                    <a:srcRect/>
-                    <a:stretch>
-                      <a:fillRect/>
-                    </a:stretch>
-                  </pic:blipFill>
-                  <pic:spPr bwMode="auto">
-                    <a:xfrm>
-                      <a:off x="0" y="0"/>
-                      <a:ext cx="1238250" cy="1238250"/>
-                    </a:xfrm>
-                    <a:prstGeom prst="rect">
-                      <a:avLst/>
-                    </a:prstGeom>
-                  </pic:spPr>
-                </pic:pic>
-              </a:graphicData>
-            </a:graphic>
-          </wp:inline>
-        </w:drawing>
+        <w:rPr>
+          <w:rFonts w:ascii="Simplified Arabic" w:cs="Simplified Arabic" w:eastAsia="Simplified Arabic" w:hAnsi="Simplified Arabic"/>
+          <w:b/>
+          <w:bCs/>
+          <w:sz w:val="32"/>
+          <w:szCs w:val="32"/>
+          <w:rtl/>
+        </w:rPr>
+        <w:t xml:space="preserve">الكلية الأكاديمية أحفا</w:t>
       </w:r>
     </w:p>
     <w:p>
@@ -57,30 +35,12 @@
       <w:r>
         <w:rPr>
           <w:rFonts w:ascii="Simplified Arabic" w:cs="Simplified Arabic" w:eastAsia="Simplified Arabic" w:hAnsi="Simplified Arabic"/>
-          <w:b/>
-          <w:bCs/>
-          <w:sz w:val="30"/>
-          <w:szCs w:val="30"/>
-          <w:rtl/>
-        </w:rPr>
-        <w:t xml:space="preserve">كلية تلبيوت الأكاديمية للتربية، حولون</w:t>
-      </w:r>
-    </w:p>
-    <w:p>
-      <w:pPr>
-        <w:bidi/>
-        <w:spacing w:after="120" w:line="360" w:lineRule="auto"/>
-        <w:jc w:val="center"/>
-      </w:pPr>
-      <w:r>
-        <w:rPr>
-          <w:rFonts w:ascii="Simplified Arabic" w:cs="Simplified Arabic" w:eastAsia="Simplified Arabic" w:hAnsi="Simplified Arabic"/>
-          <w:b w:val="false"/>
-          <w:sz w:val="28"/>
-          <w:szCs w:val="28"/>
-          <w:rtl/>
-        </w:rPr>
-        <w:t xml:space="preserve">قسم التربية للطفولة المبكرة</w:t>
+          <w:b w:val="false"/>
+          <w:sz w:val="28"/>
+          <w:szCs w:val="28"/>
+          <w:rtl/>
+        </w:rPr>
+        <w:t xml:space="preserve">قسم التربية</w:t>
       </w:r>
     </w:p>
     <w:p>
@@ -733,6 +693,23 @@
           <w:rtl/>
         </w:rPr>
         <w:t xml:space="preserve">الملاحق</w:t>
+      </w:r>
+    </w:p>
+    <w:p>
+      <w:pPr>
+        <w:bidi/>
+        <w:spacing w:after="120" w:line="360" w:lineRule="auto"/>
+        <w:jc w:val="both"/>
+      </w:pPr>
+      <w:r>
+        <w:rPr>
+          <w:rFonts w:ascii="Simplified Arabic" w:cs="Simplified Arabic" w:eastAsia="Simplified Arabic" w:hAnsi="Simplified Arabic"/>
+          <w:b w:val="false"/>
+          <w:sz w:val="28"/>
+          <w:szCs w:val="28"/>
+          <w:rtl/>
+        </w:rPr>
+        <w:t xml:space="preserve">טופס הצהרה על שימוש בבינה מלאכותית (עמוד נפרד)</w:t>
       </w:r>
     </w:p>
     <w:p>
@@ -3816,6 +3793,780 @@
     <w:p>
       <w:pPr>
         <w:bidi/>
+        <w:spacing w:after="120" w:line="360" w:lineRule="auto"/>
+        <w:jc w:val="both"/>
+      </w:pPr>
+      <w:r>
+        <w:rPr>
+          <w:rFonts w:ascii="Simplified Arabic" w:cs="Simplified Arabic" w:eastAsia="Simplified Arabic" w:hAnsi="Simplified Arabic"/>
+          <w:b w:val="false"/>
+          <w:sz w:val="28"/>
+          <w:szCs w:val="28"/>
+          <w:rtl/>
+        </w:rPr>
+        <w:t xml:space="preserve">ويلخّص الجدول رقم 2 الثيمات السبع ومواضع الاتفاق والاختلاف والإجابات المتميّزة فيها، قبل عرضها بالتفصيل.</w:t>
+      </w:r>
+    </w:p>
+    <w:tbl>
+      <w:tblPr>
+        <w:bidiVisual/>
+        <w:tblW w:type="dxa" w:w="9300"/>
+        <w:tblBorders>
+          <w:top w:val="single" w:color="auto" w:sz="4"/>
+          <w:left w:val="single" w:color="auto" w:sz="4"/>
+          <w:bottom w:val="single" w:color="auto" w:sz="4"/>
+          <w:right w:val="single" w:color="auto" w:sz="4"/>
+          <w:insideH w:val="single" w:color="auto" w:sz="4"/>
+          <w:insideV w:val="single" w:color="auto" w:sz="4"/>
+        </w:tblBorders>
+      </w:tblPr>
+      <w:tblGrid>
+        <w:gridCol w:w="1500"/>
+        <w:gridCol w:w="2600"/>
+        <w:gridCol w:w="2600"/>
+        <w:gridCol w:w="2600"/>
+      </w:tblGrid>
+      <w:tr>
+        <w:trPr>
+          <w:tblHeader/>
+        </w:trPr>
+        <w:tc>
+          <w:tcPr>
+            <w:tcW w:type="dxa" w:w="0"/>
+            <w:shd w:fill="E8E4EF" w:val="clear"/>
+          </w:tcPr>
+          <w:p>
+            <w:pPr>
+              <w:bidi/>
+              <w:spacing w:after="60" w:before="60" w:line="240" w:lineRule="auto"/>
+              <w:jc w:val="center"/>
+            </w:pPr>
+            <w:r>
+              <w:rPr>
+                <w:rFonts w:ascii="Simplified Arabic" w:cs="Simplified Arabic" w:eastAsia="Simplified Arabic" w:hAnsi="Simplified Arabic"/>
+                <w:b/>
+                <w:bCs/>
+                <w:sz w:val="24"/>
+                <w:szCs w:val="24"/>
+                <w:rtl/>
+              </w:rPr>
+              <w:t xml:space="preserve">الثيمة</w:t>
+            </w:r>
+          </w:p>
+        </w:tc>
+        <w:tc>
+          <w:tcPr>
+            <w:tcW w:type="dxa" w:w="0"/>
+            <w:shd w:fill="E8E4EF" w:val="clear"/>
+          </w:tcPr>
+          <w:p>
+            <w:pPr>
+              <w:bidi/>
+              <w:spacing w:after="60" w:before="60" w:line="240" w:lineRule="auto"/>
+              <w:jc w:val="center"/>
+            </w:pPr>
+            <w:r>
+              <w:rPr>
+                <w:rFonts w:ascii="Simplified Arabic" w:cs="Simplified Arabic" w:eastAsia="Simplified Arabic" w:hAnsi="Simplified Arabic"/>
+                <w:b/>
+                <w:bCs/>
+                <w:sz w:val="24"/>
+                <w:szCs w:val="24"/>
+                <w:rtl/>
+              </w:rPr>
+              <w:t xml:space="preserve">المتفق عليه</w:t>
+            </w:r>
+          </w:p>
+        </w:tc>
+        <w:tc>
+          <w:tcPr>
+            <w:tcW w:type="dxa" w:w="0"/>
+            <w:shd w:fill="E8E4EF" w:val="clear"/>
+          </w:tcPr>
+          <w:p>
+            <w:pPr>
+              <w:bidi/>
+              <w:spacing w:after="60" w:before="60" w:line="240" w:lineRule="auto"/>
+              <w:jc w:val="center"/>
+            </w:pPr>
+            <w:r>
+              <w:rPr>
+                <w:rFonts w:ascii="Simplified Arabic" w:cs="Simplified Arabic" w:eastAsia="Simplified Arabic" w:hAnsi="Simplified Arabic"/>
+                <w:b/>
+                <w:bCs/>
+                <w:sz w:val="24"/>
+                <w:szCs w:val="24"/>
+                <w:rtl/>
+              </w:rPr>
+              <w:t xml:space="preserve">المختلف عليه</w:t>
+            </w:r>
+          </w:p>
+        </w:tc>
+        <w:tc>
+          <w:tcPr>
+            <w:tcW w:type="dxa" w:w="0"/>
+            <w:shd w:fill="E8E4EF" w:val="clear"/>
+          </w:tcPr>
+          <w:p>
+            <w:pPr>
+              <w:bidi/>
+              <w:spacing w:after="60" w:before="60" w:line="240" w:lineRule="auto"/>
+              <w:jc w:val="center"/>
+            </w:pPr>
+            <w:r>
+              <w:rPr>
+                <w:rFonts w:ascii="Simplified Arabic" w:cs="Simplified Arabic" w:eastAsia="Simplified Arabic" w:hAnsi="Simplified Arabic"/>
+                <w:b/>
+                <w:bCs/>
+                <w:sz w:val="24"/>
+                <w:szCs w:val="24"/>
+                <w:rtl/>
+              </w:rPr>
+              <w:t xml:space="preserve">إجابة متميّزة</w:t>
+            </w:r>
+          </w:p>
+        </w:tc>
+      </w:tr>
+      <w:tr>
+        <w:tc>
+          <w:tcPr>
+            <w:tcW w:type="dxa" w:w="1500"/>
+          </w:tcPr>
+          <w:p>
+            <w:pPr>
+              <w:bidi/>
+              <w:spacing w:after="60" w:before="60" w:line="240" w:lineRule="auto"/>
+              <w:jc w:val="right"/>
+            </w:pPr>
+            <w:r>
+              <w:rPr>
+                <w:rFonts w:ascii="Simplified Arabic" w:cs="Simplified Arabic" w:eastAsia="Simplified Arabic" w:hAnsi="Simplified Arabic"/>
+                <w:b w:val="false"/>
+                <w:sz w:val="22"/>
+                <w:szCs w:val="22"/>
+                <w:rtl/>
+              </w:rPr>
+              <w:t xml:space="preserve">الثيمة الأولى: المختبر الاجتماعي الأول</w:t>
+            </w:r>
+          </w:p>
+        </w:tc>
+        <w:tc>
+          <w:tcPr>
+            <w:tcW w:type="dxa" w:w="2600"/>
+          </w:tcPr>
+          <w:p>
+            <w:pPr>
+              <w:bidi/>
+              <w:spacing w:after="60" w:before="60" w:line="240" w:lineRule="auto"/>
+              <w:jc w:val="right"/>
+            </w:pPr>
+            <w:r>
+              <w:rPr>
+                <w:rFonts w:ascii="Simplified Arabic" w:cs="Simplified Arabic" w:eastAsia="Simplified Arabic" w:hAnsi="Simplified Arabic"/>
+                <w:b w:val="false"/>
+                <w:sz w:val="22"/>
+                <w:szCs w:val="22"/>
+                <w:rtl/>
+              </w:rPr>
+              <w:t xml:space="preserve">اتفاق كامل: اللعب هو الموقف الذي تُكتسب فيه المهارة الاجتماعية في سياقها لا بالشرح</w:t>
+            </w:r>
+          </w:p>
+        </w:tc>
+        <w:tc>
+          <w:tcPr>
+            <w:tcW w:type="dxa" w:w="2600"/>
+          </w:tcPr>
+          <w:p>
+            <w:pPr>
+              <w:bidi/>
+              <w:spacing w:after="60" w:before="60" w:line="240" w:lineRule="auto"/>
+              <w:jc w:val="right"/>
+            </w:pPr>
+            <w:r>
+              <w:rPr>
+                <w:rFonts w:ascii="Simplified Arabic" w:cs="Simplified Arabic" w:eastAsia="Simplified Arabic" w:hAnsi="Simplified Arabic"/>
+                <w:b w:val="false"/>
+                <w:sz w:val="22"/>
+                <w:szCs w:val="22"/>
+                <w:rtl/>
+              </w:rPr>
+              <w:t xml:space="preserve">لا يوجد خلاف</w:t>
+            </w:r>
+          </w:p>
+        </w:tc>
+        <w:tc>
+          <w:tcPr>
+            <w:tcW w:type="dxa" w:w="2600"/>
+          </w:tcPr>
+          <w:p>
+            <w:pPr>
+              <w:bidi/>
+              <w:spacing w:after="60" w:before="60" w:line="240" w:lineRule="auto"/>
+              <w:jc w:val="right"/>
+            </w:pPr>
+            <w:r>
+              <w:rPr>
+                <w:rFonts w:ascii="Simplified Arabic" w:cs="Simplified Arabic" w:eastAsia="Simplified Arabic" w:hAnsi="Simplified Arabic"/>
+                <w:b w:val="false"/>
+                <w:sz w:val="22"/>
+                <w:szCs w:val="22"/>
+                <w:rtl/>
+              </w:rPr>
+              <w:t xml:space="preserve">لينا: اللغة تأتي من الحاجة داخل اللعبة لا من البطاقات</w:t>
+            </w:r>
+          </w:p>
+        </w:tc>
+      </w:tr>
+      <w:tr>
+        <w:tc>
+          <w:tcPr>
+            <w:tcW w:type="dxa" w:w="1500"/>
+          </w:tcPr>
+          <w:p>
+            <w:pPr>
+              <w:bidi/>
+              <w:spacing w:after="60" w:before="60" w:line="240" w:lineRule="auto"/>
+              <w:jc w:val="right"/>
+            </w:pPr>
+            <w:r>
+              <w:rPr>
+                <w:rFonts w:ascii="Simplified Arabic" w:cs="Simplified Arabic" w:eastAsia="Simplified Arabic" w:hAnsi="Simplified Arabic"/>
+                <w:b w:val="false"/>
+                <w:sz w:val="22"/>
+                <w:szCs w:val="22"/>
+                <w:rtl/>
+              </w:rPr>
+              <w:t xml:space="preserve">الثيمة الثانية: البعد الانفعالي</w:t>
+            </w:r>
+          </w:p>
+        </w:tc>
+        <w:tc>
+          <w:tcPr>
+            <w:tcW w:type="dxa" w:w="2600"/>
+          </w:tcPr>
+          <w:p>
+            <w:pPr>
+              <w:bidi/>
+              <w:spacing w:after="60" w:before="60" w:line="240" w:lineRule="auto"/>
+              <w:jc w:val="right"/>
+            </w:pPr>
+            <w:r>
+              <w:rPr>
+                <w:rFonts w:ascii="Simplified Arabic" w:cs="Simplified Arabic" w:eastAsia="Simplified Arabic" w:hAnsi="Simplified Arabic"/>
+                <w:b w:val="false"/>
+                <w:sz w:val="22"/>
+                <w:szCs w:val="22"/>
+                <w:rtl/>
+              </w:rPr>
+              <w:t xml:space="preserve">اتفاق: الأمان والثقة واحتمال الإحباط شرط للمهارة الاجتماعية لا نتيجة لها</w:t>
+            </w:r>
+          </w:p>
+        </w:tc>
+        <w:tc>
+          <w:tcPr>
+            <w:tcW w:type="dxa" w:w="2600"/>
+          </w:tcPr>
+          <w:p>
+            <w:pPr>
+              <w:bidi/>
+              <w:spacing w:after="60" w:before="60" w:line="240" w:lineRule="auto"/>
+              <w:jc w:val="right"/>
+            </w:pPr>
+            <w:r>
+              <w:rPr>
+                <w:rFonts w:ascii="Simplified Arabic" w:cs="Simplified Arabic" w:eastAsia="Simplified Arabic" w:hAnsi="Simplified Arabic"/>
+                <w:b w:val="false"/>
+                <w:sz w:val="22"/>
+                <w:szCs w:val="22"/>
+                <w:rtl/>
+              </w:rPr>
+              <w:t xml:space="preserve">خلاف حول الطفل المنسحب: الدفع نحو المجموعة مقابل احترام إيقاعه</w:t>
+            </w:r>
+          </w:p>
+        </w:tc>
+        <w:tc>
+          <w:tcPr>
+            <w:tcW w:type="dxa" w:w="2600"/>
+          </w:tcPr>
+          <w:p>
+            <w:pPr>
+              <w:bidi/>
+              <w:spacing w:after="60" w:before="60" w:line="240" w:lineRule="auto"/>
+              <w:jc w:val="right"/>
+            </w:pPr>
+            <w:r>
+              <w:rPr>
+                <w:rFonts w:ascii="Simplified Arabic" w:cs="Simplified Arabic" w:eastAsia="Simplified Arabic" w:hAnsi="Simplified Arabic"/>
+                <w:b w:val="false"/>
+                <w:sz w:val="22"/>
+                <w:szCs w:val="22"/>
+                <w:rtl/>
+              </w:rPr>
+              <w:t xml:space="preserve">رنا: اللعب هو المكان الوحيد الذي يخسر فيه الطفل بأمان</w:t>
+            </w:r>
+          </w:p>
+        </w:tc>
+      </w:tr>
+      <w:tr>
+        <w:tc>
+          <w:tcPr>
+            <w:tcW w:type="dxa" w:w="1500"/>
+          </w:tcPr>
+          <w:p>
+            <w:pPr>
+              <w:bidi/>
+              <w:spacing w:after="60" w:before="60" w:line="240" w:lineRule="auto"/>
+              <w:jc w:val="right"/>
+            </w:pPr>
+            <w:r>
+              <w:rPr>
+                <w:rFonts w:ascii="Simplified Arabic" w:cs="Simplified Arabic" w:eastAsia="Simplified Arabic" w:hAnsi="Simplified Arabic"/>
+                <w:b w:val="false"/>
+                <w:sz w:val="22"/>
+                <w:szCs w:val="22"/>
+                <w:rtl/>
+              </w:rPr>
+              <w:t xml:space="preserve">الثيمة الثالثة: نوع اللعب الأنجع</w:t>
+            </w:r>
+          </w:p>
+        </w:tc>
+        <w:tc>
+          <w:tcPr>
+            <w:tcW w:type="dxa" w:w="2600"/>
+          </w:tcPr>
+          <w:p>
+            <w:pPr>
+              <w:bidi/>
+              <w:spacing w:after="60" w:before="60" w:line="240" w:lineRule="auto"/>
+              <w:jc w:val="right"/>
+            </w:pPr>
+            <w:r>
+              <w:rPr>
+                <w:rFonts w:ascii="Simplified Arabic" w:cs="Simplified Arabic" w:eastAsia="Simplified Arabic" w:hAnsi="Simplified Arabic"/>
+                <w:b w:val="false"/>
+                <w:sz w:val="22"/>
+                <w:szCs w:val="22"/>
+                <w:rtl/>
+              </w:rPr>
+              <w:t xml:space="preserve">اتفاق كامل على أولوية اللعب السوسيودرامي</w:t>
+            </w:r>
+          </w:p>
+        </w:tc>
+        <w:tc>
+          <w:tcPr>
+            <w:tcW w:type="dxa" w:w="2600"/>
+          </w:tcPr>
+          <w:p>
+            <w:pPr>
+              <w:bidi/>
+              <w:spacing w:after="60" w:before="60" w:line="240" w:lineRule="auto"/>
+              <w:jc w:val="right"/>
+            </w:pPr>
+            <w:r>
+              <w:rPr>
+                <w:rFonts w:ascii="Simplified Arabic" w:cs="Simplified Arabic" w:eastAsia="Simplified Arabic" w:hAnsi="Simplified Arabic"/>
+                <w:b w:val="false"/>
+                <w:sz w:val="22"/>
+                <w:szCs w:val="22"/>
+                <w:rtl/>
+              </w:rPr>
+              <w:t xml:space="preserve">خلاف حادّ حول الألعاب التنافسية: مدرسة لتحمّل الخسارة مقابل مصدر للإقصاء</w:t>
+            </w:r>
+          </w:p>
+        </w:tc>
+        <w:tc>
+          <w:tcPr>
+            <w:tcW w:type="dxa" w:w="2600"/>
+          </w:tcPr>
+          <w:p>
+            <w:pPr>
+              <w:bidi/>
+              <w:spacing w:after="60" w:before="60" w:line="240" w:lineRule="auto"/>
+              <w:jc w:val="right"/>
+            </w:pPr>
+            <w:r>
+              <w:rPr>
+                <w:rFonts w:ascii="Simplified Arabic" w:cs="Simplified Arabic" w:eastAsia="Simplified Arabic" w:hAnsi="Simplified Arabic"/>
+                <w:b w:val="false"/>
+                <w:sz w:val="22"/>
+                <w:szCs w:val="22"/>
+                <w:rtl/>
+              </w:rPr>
+              <w:t xml:space="preserve">سهام: تحويل التنافس بين فريقين إلى هدف مشترك، تحدٍّ بلا خاسر</w:t>
+            </w:r>
+          </w:p>
+        </w:tc>
+      </w:tr>
+      <w:tr>
+        <w:tc>
+          <w:tcPr>
+            <w:tcW w:type="dxa" w:w="1500"/>
+          </w:tcPr>
+          <w:p>
+            <w:pPr>
+              <w:bidi/>
+              <w:spacing w:after="60" w:before="60" w:line="240" w:lineRule="auto"/>
+              <w:jc w:val="right"/>
+            </w:pPr>
+            <w:r>
+              <w:rPr>
+                <w:rFonts w:ascii="Simplified Arabic" w:cs="Simplified Arabic" w:eastAsia="Simplified Arabic" w:hAnsi="Simplified Arabic"/>
+                <w:b w:val="false"/>
+                <w:sz w:val="22"/>
+                <w:szCs w:val="22"/>
+                <w:rtl/>
+              </w:rPr>
+              <w:t xml:space="preserve">الثيمة الرابعة: الحرّ مقابل الموجّه</w:t>
+            </w:r>
+          </w:p>
+        </w:tc>
+        <w:tc>
+          <w:tcPr>
+            <w:tcW w:type="dxa" w:w="2600"/>
+          </w:tcPr>
+          <w:p>
+            <w:pPr>
+              <w:bidi/>
+              <w:spacing w:after="60" w:before="60" w:line="240" w:lineRule="auto"/>
+              <w:jc w:val="right"/>
+            </w:pPr>
+            <w:r>
+              <w:rPr>
+                <w:rFonts w:ascii="Simplified Arabic" w:cs="Simplified Arabic" w:eastAsia="Simplified Arabic" w:hAnsi="Simplified Arabic"/>
+                <w:b w:val="false"/>
+                <w:sz w:val="22"/>
+                <w:szCs w:val="22"/>
+                <w:rtl/>
+              </w:rPr>
+              <w:t xml:space="preserve">اتفاق على رفض الفصل الحادّ بينهما</w:t>
+            </w:r>
+          </w:p>
+        </w:tc>
+        <w:tc>
+          <w:tcPr>
+            <w:tcW w:type="dxa" w:w="2600"/>
+          </w:tcPr>
+          <w:p>
+            <w:pPr>
+              <w:bidi/>
+              <w:spacing w:after="60" w:before="60" w:line="240" w:lineRule="auto"/>
+              <w:jc w:val="right"/>
+            </w:pPr>
+            <w:r>
+              <w:rPr>
+                <w:rFonts w:ascii="Simplified Arabic" w:cs="Simplified Arabic" w:eastAsia="Simplified Arabic" w:hAnsi="Simplified Arabic"/>
+                <w:b w:val="false"/>
+                <w:sz w:val="22"/>
+                <w:szCs w:val="22"/>
+                <w:rtl/>
+              </w:rPr>
+              <w:t xml:space="preserve">خلاف حول موقع الخطّ: الانتظار عشر ثوانٍ مقابل التدخّل حين يتكرّر النمط</w:t>
+            </w:r>
+          </w:p>
+        </w:tc>
+        <w:tc>
+          <w:tcPr>
+            <w:tcW w:type="dxa" w:w="2600"/>
+          </w:tcPr>
+          <w:p>
+            <w:pPr>
+              <w:bidi/>
+              <w:spacing w:after="60" w:before="60" w:line="240" w:lineRule="auto"/>
+              <w:jc w:val="right"/>
+            </w:pPr>
+            <w:r>
+              <w:rPr>
+                <w:rFonts w:ascii="Simplified Arabic" w:cs="Simplified Arabic" w:eastAsia="Simplified Arabic" w:hAnsi="Simplified Arabic"/>
+                <w:b w:val="false"/>
+                <w:sz w:val="22"/>
+                <w:szCs w:val="22"/>
+                <w:rtl/>
+              </w:rPr>
+              <w:t xml:space="preserve">عبير: التمييز بين التدخّل على اللعبة والتدخّل على الطفل</w:t>
+            </w:r>
+          </w:p>
+        </w:tc>
+      </w:tr>
+      <w:tr>
+        <w:tc>
+          <w:tcPr>
+            <w:tcW w:type="dxa" w:w="1500"/>
+          </w:tcPr>
+          <w:p>
+            <w:pPr>
+              <w:bidi/>
+              <w:spacing w:after="60" w:before="60" w:line="240" w:lineRule="auto"/>
+              <w:jc w:val="right"/>
+            </w:pPr>
+            <w:r>
+              <w:rPr>
+                <w:rFonts w:ascii="Simplified Arabic" w:cs="Simplified Arabic" w:eastAsia="Simplified Arabic" w:hAnsi="Simplified Arabic"/>
+                <w:b w:val="false"/>
+                <w:sz w:val="22"/>
+                <w:szCs w:val="22"/>
+                <w:rtl/>
+              </w:rPr>
+              <w:t xml:space="preserve">الثيمة الخامسة: الحواجز البنيوية</w:t>
+            </w:r>
+          </w:p>
+        </w:tc>
+        <w:tc>
+          <w:tcPr>
+            <w:tcW w:type="dxa" w:w="2600"/>
+          </w:tcPr>
+          <w:p>
+            <w:pPr>
+              <w:bidi/>
+              <w:spacing w:after="60" w:before="60" w:line="240" w:lineRule="auto"/>
+              <w:jc w:val="right"/>
+            </w:pPr>
+            <w:r>
+              <w:rPr>
+                <w:rFonts w:ascii="Simplified Arabic" w:cs="Simplified Arabic" w:eastAsia="Simplified Arabic" w:hAnsi="Simplified Arabic"/>
+                <w:b w:val="false"/>
+                <w:sz w:val="22"/>
+                <w:szCs w:val="22"/>
+                <w:rtl/>
+              </w:rPr>
+              <w:t xml:space="preserve">اتفاق: العدد والمساحة وتآكل وقت اللعب هي العائق الأول لا نقص القناعة</w:t>
+            </w:r>
+          </w:p>
+        </w:tc>
+        <w:tc>
+          <w:tcPr>
+            <w:tcW w:type="dxa" w:w="2600"/>
+          </w:tcPr>
+          <w:p>
+            <w:pPr>
+              <w:bidi/>
+              <w:spacing w:after="60" w:before="60" w:line="240" w:lineRule="auto"/>
+              <w:jc w:val="right"/>
+            </w:pPr>
+            <w:r>
+              <w:rPr>
+                <w:rFonts w:ascii="Simplified Arabic" w:cs="Simplified Arabic" w:eastAsia="Simplified Arabic" w:hAnsi="Simplified Arabic"/>
+                <w:b w:val="false"/>
+                <w:sz w:val="22"/>
+                <w:szCs w:val="22"/>
+                <w:rtl/>
+              </w:rPr>
+              <w:t xml:space="preserve">تباين في حدّة الشعور بحسب عدد الأطفال في المجموعة</w:t>
+            </w:r>
+          </w:p>
+        </w:tc>
+        <w:tc>
+          <w:tcPr>
+            <w:tcW w:type="dxa" w:w="2600"/>
+          </w:tcPr>
+          <w:p>
+            <w:pPr>
+              <w:bidi/>
+              <w:spacing w:after="60" w:before="60" w:line="240" w:lineRule="auto"/>
+              <w:jc w:val="right"/>
+            </w:pPr>
+            <w:r>
+              <w:rPr>
+                <w:rFonts w:ascii="Simplified Arabic" w:cs="Simplified Arabic" w:eastAsia="Simplified Arabic" w:hAnsi="Simplified Arabic"/>
+                <w:b w:val="false"/>
+                <w:sz w:val="22"/>
+                <w:szCs w:val="22"/>
+                <w:rtl/>
+              </w:rPr>
+              <w:t xml:space="preserve">سهام: الأطفال المدمجون ليسوا فئة واحدة، والحاجة تختلف باختلاف الصعوبة</w:t>
+            </w:r>
+          </w:p>
+        </w:tc>
+      </w:tr>
+      <w:tr>
+        <w:tc>
+          <w:tcPr>
+            <w:tcW w:type="dxa" w:w="1500"/>
+          </w:tcPr>
+          <w:p>
+            <w:pPr>
+              <w:bidi/>
+              <w:spacing w:after="60" w:before="60" w:line="240" w:lineRule="auto"/>
+              <w:jc w:val="right"/>
+            </w:pPr>
+            <w:r>
+              <w:rPr>
+                <w:rFonts w:ascii="Simplified Arabic" w:cs="Simplified Arabic" w:eastAsia="Simplified Arabic" w:hAnsi="Simplified Arabic"/>
+                <w:b w:val="false"/>
+                <w:sz w:val="22"/>
+                <w:szCs w:val="22"/>
+                <w:rtl/>
+              </w:rPr>
+              <w:t xml:space="preserve">الثيمة السادسة: موقف الأهل والمنظومة</w:t>
+            </w:r>
+          </w:p>
+        </w:tc>
+        <w:tc>
+          <w:tcPr>
+            <w:tcW w:type="dxa" w:w="2600"/>
+          </w:tcPr>
+          <w:p>
+            <w:pPr>
+              <w:bidi/>
+              <w:spacing w:after="60" w:before="60" w:line="240" w:lineRule="auto"/>
+              <w:jc w:val="right"/>
+            </w:pPr>
+            <w:r>
+              <w:rPr>
+                <w:rFonts w:ascii="Simplified Arabic" w:cs="Simplified Arabic" w:eastAsia="Simplified Arabic" w:hAnsi="Simplified Arabic"/>
+                <w:b w:val="false"/>
+                <w:sz w:val="22"/>
+                <w:szCs w:val="22"/>
+                <w:rtl/>
+              </w:rPr>
+              <w:t xml:space="preserve">اتفاق: المعلمة تجد نفسها مدافعة عن اللعب أمام توقّعات أكاديمية</w:t>
+            </w:r>
+          </w:p>
+        </w:tc>
+        <w:tc>
+          <w:tcPr>
+            <w:tcW w:type="dxa" w:w="2600"/>
+          </w:tcPr>
+          <w:p>
+            <w:pPr>
+              <w:bidi/>
+              <w:spacing w:after="60" w:before="60" w:line="240" w:lineRule="auto"/>
+              <w:jc w:val="right"/>
+            </w:pPr>
+            <w:r>
+              <w:rPr>
+                <w:rFonts w:ascii="Simplified Arabic" w:cs="Simplified Arabic" w:eastAsia="Simplified Arabic" w:hAnsi="Simplified Arabic"/>
+                <w:b w:val="false"/>
+                <w:sz w:val="22"/>
+                <w:szCs w:val="22"/>
+                <w:rtl/>
+              </w:rPr>
+              <w:t xml:space="preserve">تباين في مصدر الضغط: الأهل مقابل المنظومة والتفتيش</w:t>
+            </w:r>
+          </w:p>
+        </w:tc>
+        <w:tc>
+          <w:tcPr>
+            <w:tcW w:type="dxa" w:w="2600"/>
+          </w:tcPr>
+          <w:p>
+            <w:pPr>
+              <w:bidi/>
+              <w:spacing w:after="60" w:before="60" w:line="240" w:lineRule="auto"/>
+              <w:jc w:val="right"/>
+            </w:pPr>
+            <w:r>
+              <w:rPr>
+                <w:rFonts w:ascii="Simplified Arabic" w:cs="Simplified Arabic" w:eastAsia="Simplified Arabic" w:hAnsi="Simplified Arabic"/>
+                <w:b w:val="false"/>
+                <w:sz w:val="22"/>
+                <w:szCs w:val="22"/>
+                <w:rtl/>
+              </w:rPr>
+              <w:t xml:space="preserve">رنا: توثيق اللعب بالصورة مع تفسير تربوي مكتوب</w:t>
+            </w:r>
+          </w:p>
+        </w:tc>
+      </w:tr>
+      <w:tr>
+        <w:tc>
+          <w:tcPr>
+            <w:tcW w:type="dxa" w:w="1500"/>
+          </w:tcPr>
+          <w:p>
+            <w:pPr>
+              <w:bidi/>
+              <w:spacing w:after="60" w:before="60" w:line="240" w:lineRule="auto"/>
+              <w:jc w:val="right"/>
+            </w:pPr>
+            <w:r>
+              <w:rPr>
+                <w:rFonts w:ascii="Simplified Arabic" w:cs="Simplified Arabic" w:eastAsia="Simplified Arabic" w:hAnsi="Simplified Arabic"/>
+                <w:b w:val="false"/>
+                <w:sz w:val="22"/>
+                <w:szCs w:val="22"/>
+                <w:rtl/>
+              </w:rPr>
+              <w:t xml:space="preserve">الثيمة السابعة: الاستراتيجيات الميدانية</w:t>
+            </w:r>
+          </w:p>
+        </w:tc>
+        <w:tc>
+          <w:tcPr>
+            <w:tcW w:type="dxa" w:w="2600"/>
+          </w:tcPr>
+          <w:p>
+            <w:pPr>
+              <w:bidi/>
+              <w:spacing w:after="60" w:before="60" w:line="240" w:lineRule="auto"/>
+              <w:jc w:val="right"/>
+            </w:pPr>
+            <w:r>
+              <w:rPr>
+                <w:rFonts w:ascii="Simplified Arabic" w:cs="Simplified Arabic" w:eastAsia="Simplified Arabic" w:hAnsi="Simplified Arabic"/>
+                <w:b w:val="false"/>
+                <w:sz w:val="22"/>
+                <w:szCs w:val="22"/>
+                <w:rtl/>
+              </w:rPr>
+              <w:t xml:space="preserve">اتفاق: أغلب الاستراتيجيات طُوّرت بالتجربة والخطأ لا في استكمال</w:t>
+            </w:r>
+          </w:p>
+        </w:tc>
+        <w:tc>
+          <w:tcPr>
+            <w:tcW w:type="dxa" w:w="2600"/>
+          </w:tcPr>
+          <w:p>
+            <w:pPr>
+              <w:bidi/>
+              <w:spacing w:after="60" w:before="60" w:line="240" w:lineRule="auto"/>
+              <w:jc w:val="right"/>
+            </w:pPr>
+            <w:r>
+              <w:rPr>
+                <w:rFonts w:ascii="Simplified Arabic" w:cs="Simplified Arabic" w:eastAsia="Simplified Arabic" w:hAnsi="Simplified Arabic"/>
+                <w:b w:val="false"/>
+                <w:sz w:val="22"/>
+                <w:szCs w:val="22"/>
+                <w:rtl/>
+              </w:rPr>
+              <w:t xml:space="preserve">تباين في نوع الحلّ: تنظيمي، تواصلي، أو وساطة اجتماعية</w:t>
+            </w:r>
+          </w:p>
+        </w:tc>
+        <w:tc>
+          <w:tcPr>
+            <w:tcW w:type="dxa" w:w="2600"/>
+          </w:tcPr>
+          <w:p>
+            <w:pPr>
+              <w:bidi/>
+              <w:spacing w:after="60" w:before="60" w:line="240" w:lineRule="auto"/>
+              <w:jc w:val="right"/>
+            </w:pPr>
+            <w:r>
+              <w:rPr>
+                <w:rFonts w:ascii="Simplified Arabic" w:cs="Simplified Arabic" w:eastAsia="Simplified Arabic" w:hAnsi="Simplified Arabic"/>
+                <w:b w:val="false"/>
+                <w:sz w:val="22"/>
+                <w:szCs w:val="22"/>
+                <w:rtl/>
+              </w:rPr>
+              <w:t xml:space="preserve">نور: صور الأقدام على الأرض لتحديد عدد الأطفال في كلّ ركن</w:t>
+            </w:r>
+          </w:p>
+        </w:tc>
+      </w:tr>
+    </w:tbl>
+    <w:p>
+      <w:pPr>
+        <w:bidi/>
+        <w:spacing w:after="120" w:line="360" w:lineRule="auto"/>
+      </w:pPr>
+    </w:p>
+    <w:p>
+      <w:pPr>
+        <w:bidi/>
         <w:spacing w:after="160" w:line="360" w:lineRule="auto"/>
         <w:jc w:val="right"/>
       </w:pPr>
@@ -9691,6 +10442,301 @@
           <w:rtl/>
         </w:rPr>
         <w:t xml:space="preserve">ج: بقول لها: انتبهي مين برّا اللعبة، وسجّلي. لأنّه الذاكرة بتخون والملاحظة بتنجرّ ورا اللي بيعمل ضجّة. وبقول لها كمان: ما تخافي تتدخّلي. في خطاب سائد إنّه المعلمة لازم تنسحب، وأنا بشوف إنّه هاد صحيح بس مش دايماً، وإنّه في أطفال بيدفعوا ثمن انسحابنا. أمّا المستقبل، فأنا متفائلة حذرة. بشوف إنّه في وعي متزايد بأهمية اللعب على المستوى النظري، وبنفس الوقت بشوف إنّه الممارسة بتروح بالاتّجاه المعاكس بسبب الضغط الأكاديمي والأعداد. بتمنّى إنّه يصير في قرار واضح إنّه هاد وقت محمي. لأنّه إذا ضلّينا نعتمد على قناعة المعلمة الفردية، الموضوع رح يضلّ متعلّق بمين صادفت الطفل هالسنة، وهاد مش عدل لا للأطفال ولا لإلنا. وبقول لها إشي أخير: احكي عن اللي بتعمليه بلغة مهنية، حتى مع حالك. لمّا بتقولي لعبنا، بتصغّري شغلك. لمّا بتقولي اشتغلنا على الانضمام للمجموعة، بتشوفيه كما هو. إحنا أول من صدّق إنّه اللعب مش شغل، ولازم نبطّل.</w:t>
+      </w:r>
+    </w:p>
+    <w:p>
+      <w:pPr>
+        <w:pageBreakBefore/>
+        <w:bidi/>
+        <w:spacing w:after="240" w:line="300" w:lineRule="auto"/>
+        <w:jc w:val="center"/>
+      </w:pPr>
+      <w:r>
+        <w:rPr>
+          <w:rFonts w:ascii="David" w:cs="David" w:eastAsia="David" w:hAnsi="David"/>
+          <w:b/>
+          <w:bCs/>
+          <w:sz w:val="32"/>
+          <w:szCs w:val="32"/>
+          <w:rtl/>
+        </w:rPr>
+        <w:t xml:space="preserve">טופס הצהרה על שימוש בבינה מלאכותית</w:t>
+      </w:r>
+    </w:p>
+    <w:p>
+      <w:pPr>
+        <w:bidi/>
+        <w:spacing w:after="240" w:line="300" w:lineRule="auto"/>
+        <w:jc w:val="right"/>
+      </w:pPr>
+      <w:r>
+        <w:rPr>
+          <w:rFonts w:ascii="David" w:cs="David" w:eastAsia="David" w:hAnsi="David"/>
+          <w:b w:val="false"/>
+          <w:sz w:val="24"/>
+          <w:szCs w:val="24"/>
+          <w:rtl/>
+        </w:rPr>
+        <w:t xml:space="preserve">עמוד זה מהווה חלק בלתי נפרד מהעבודה הסמינריונית ויש להגישו חתום ומלא.</w:t>
+      </w:r>
+    </w:p>
+    <w:p>
+      <w:pPr>
+        <w:bidi/>
+        <w:spacing w:after="120" w:line="300" w:lineRule="auto"/>
+        <w:jc w:val="right"/>
+      </w:pPr>
+      <w:r>
+        <w:rPr>
+          <w:rFonts w:ascii="David" w:cs="David" w:eastAsia="David" w:hAnsi="David"/>
+          <w:b w:val="false"/>
+          <w:sz w:val="24"/>
+          <w:szCs w:val="24"/>
+          <w:rtl/>
+        </w:rPr>
+        <w:t xml:space="preserve">שם הסטודנטיות: מייסא אבו רקייק, ת.ז. 325083483  |  מהא אלנבארי, ת.ז. ______________</w:t>
+      </w:r>
+    </w:p>
+    <w:p>
+      <w:pPr>
+        <w:bidi/>
+        <w:spacing w:after="120" w:line="300" w:lineRule="auto"/>
+        <w:jc w:val="right"/>
+      </w:pPr>
+      <w:r>
+        <w:rPr>
+          <w:rFonts w:ascii="David" w:cs="David" w:eastAsia="David" w:hAnsi="David"/>
+          <w:b w:val="false"/>
+          <w:sz w:val="24"/>
+          <w:szCs w:val="24"/>
+          <w:rtl/>
+        </w:rPr>
+        <w:t xml:space="preserve">שם המרצה: ______________________________</w:t>
+      </w:r>
+    </w:p>
+    <w:p>
+      <w:pPr>
+        <w:bidi/>
+        <w:spacing w:after="240" w:line="300" w:lineRule="auto"/>
+        <w:jc w:val="right"/>
+      </w:pPr>
+      <w:r>
+        <w:rPr>
+          <w:rFonts w:ascii="David" w:cs="David" w:eastAsia="David" w:hAnsi="David"/>
+          <w:b w:val="false"/>
+          <w:sz w:val="24"/>
+          <w:szCs w:val="24"/>
+          <w:rtl/>
+        </w:rPr>
+        <w:t xml:space="preserve">נושא העבודה: יעילות המשחק הקבוצתי בשיפור האינטראקציה החברתית-נפשית אצל ילדי הגן</w:t>
+      </w:r>
+    </w:p>
+    <w:p>
+      <w:pPr>
+        <w:bidi/>
+        <w:spacing w:after="120" w:line="300" w:lineRule="auto"/>
+        <w:jc w:val="right"/>
+      </w:pPr>
+      <w:r>
+        <w:rPr>
+          <w:rFonts w:ascii="David" w:cs="David" w:eastAsia="David" w:hAnsi="David"/>
+          <w:b/>
+          <w:bCs/>
+          <w:sz w:val="24"/>
+          <w:szCs w:val="24"/>
+          <w:rtl/>
+        </w:rPr>
+        <w:t xml:space="preserve">1. האם השתמשת בכלי בינה מלאכותית כלשהם (לדוגמה: ChatGPT, Grammarly, Quillbot, מחוללי טקסט/שפה אחרים)?</w:t>
+      </w:r>
+    </w:p>
+    <w:p>
+      <w:pPr>
+        <w:bidi/>
+        <w:spacing w:after="200" w:line="300" w:lineRule="auto"/>
+        <w:jc w:val="right"/>
+      </w:pPr>
+      <w:r>
+        <w:rPr>
+          <w:rFonts w:ascii="David" w:cs="David" w:eastAsia="David" w:hAnsi="David"/>
+          <w:b w:val="false"/>
+          <w:sz w:val="24"/>
+          <w:szCs w:val="24"/>
+          <w:rtl/>
+        </w:rPr>
+        <w:t xml:space="preserve">☒ כן          ☐ לא</w:t>
+      </w:r>
+    </w:p>
+    <w:p>
+      <w:pPr>
+        <w:bidi/>
+        <w:spacing w:after="120" w:line="300" w:lineRule="auto"/>
+        <w:jc w:val="right"/>
+      </w:pPr>
+      <w:r>
+        <w:rPr>
+          <w:rFonts w:ascii="David" w:cs="David" w:eastAsia="David" w:hAnsi="David"/>
+          <w:b/>
+          <w:bCs/>
+          <w:sz w:val="24"/>
+          <w:szCs w:val="24"/>
+          <w:rtl/>
+        </w:rPr>
+        <w:t xml:space="preserve">2. אנא פרטי את שמות הכלים שבהם השתמשת:</w:t>
+      </w:r>
+    </w:p>
+    <w:p>
+      <w:pPr>
+        <w:bidi/>
+        <w:spacing w:after="200" w:line="300" w:lineRule="auto"/>
+        <w:jc w:val="right"/>
+      </w:pPr>
+      <w:r>
+        <w:rPr>
+          <w:rFonts w:ascii="David" w:cs="David" w:eastAsia="David" w:hAnsi="David"/>
+          <w:b w:val="false"/>
+          <w:sz w:val="24"/>
+          <w:szCs w:val="24"/>
+          <w:rtl/>
+        </w:rPr>
+        <w:t xml:space="preserve">______________________________________________________________________</w:t>
+      </w:r>
+    </w:p>
+    <w:p>
+      <w:pPr>
+        <w:bidi/>
+        <w:spacing w:after="120" w:line="300" w:lineRule="auto"/>
+        <w:jc w:val="right"/>
+      </w:pPr>
+      <w:r>
+        <w:rPr>
+          <w:rFonts w:ascii="David" w:cs="David" w:eastAsia="David" w:hAnsi="David"/>
+          <w:b/>
+          <w:bCs/>
+          <w:sz w:val="24"/>
+          <w:szCs w:val="24"/>
+          <w:rtl/>
+        </w:rPr>
+        <w:t xml:space="preserve">3. פרטי לאילו מטרות השתמשת בכלים אלה (למשל: ניסוח, חיפוש מקורות, ניתוח נתונים, תרגום, סיכום):</w:t>
+      </w:r>
+    </w:p>
+    <w:p>
+      <w:pPr>
+        <w:bidi/>
+        <w:spacing w:after="120" w:line="300" w:lineRule="auto"/>
+        <w:jc w:val="right"/>
+      </w:pPr>
+      <w:r>
+        <w:rPr>
+          <w:rFonts w:ascii="David" w:cs="David" w:eastAsia="David" w:hAnsi="David"/>
+          <w:b w:val="false"/>
+          <w:sz w:val="24"/>
+          <w:szCs w:val="24"/>
+          <w:rtl/>
+        </w:rPr>
+        <w:t xml:space="preserve">הכלי שימש לסיוע בניסוח ובעריכה לשונית של פרקי העבודה, לארגון מבנה הפרקים, ולסיוע בעיצוב טבלאות. איסוף הנתונים בשטח, עריכת הראיונות, תמלולם, הקידוד וזיהוי התמות בוצעו על ידי הסטודנטיות בלבד. הפרשנות והמסקנות הן של הסטודנטיות.</w:t>
+      </w:r>
+    </w:p>
+    <w:p>
+      <w:pPr>
+        <w:bidi/>
+        <w:spacing w:after="200" w:line="300" w:lineRule="auto"/>
+        <w:jc w:val="right"/>
+      </w:pPr>
+      <w:r>
+        <w:rPr>
+          <w:rFonts w:ascii="David" w:cs="David" w:eastAsia="David" w:hAnsi="David"/>
+          <w:b w:val="false"/>
+          <w:sz w:val="24"/>
+          <w:szCs w:val="24"/>
+          <w:rtl/>
+        </w:rPr>
+        <w:t xml:space="preserve">______________________________________________________________________</w:t>
+      </w:r>
+    </w:p>
+    <w:p>
+      <w:pPr>
+        <w:bidi/>
+        <w:spacing w:after="120" w:line="300" w:lineRule="auto"/>
+        <w:jc w:val="right"/>
+      </w:pPr>
+      <w:r>
+        <w:rPr>
+          <w:rFonts w:ascii="David" w:cs="David" w:eastAsia="David" w:hAnsi="David"/>
+          <w:b/>
+          <w:bCs/>
+          <w:sz w:val="24"/>
+          <w:szCs w:val="24"/>
+          <w:rtl/>
+        </w:rPr>
+        <w:t xml:space="preserve">4. כיצד וידאת את מהימנות ואמינות התוצרים שקיבלת מהבינה המלאכותית?</w:t>
+      </w:r>
+    </w:p>
+    <w:p>
+      <w:pPr>
+        <w:bidi/>
+        <w:spacing w:after="120" w:line="300" w:lineRule="auto"/>
+        <w:jc w:val="right"/>
+      </w:pPr>
+      <w:r>
+        <w:rPr>
+          <w:rFonts w:ascii="David" w:cs="David" w:eastAsia="David" w:hAnsi="David"/>
+          <w:b w:val="false"/>
+          <w:sz w:val="24"/>
+          <w:szCs w:val="24"/>
+          <w:rtl/>
+        </w:rPr>
+        <w:t xml:space="preserve">כל מקור המופיע ברשימה הביבליוגרפית אותר ונבדק במקורו על ידי הסטודנטיות, ולא נכלל אף מקור שלא אומת. כל ציטוט מהמרואיינות הוצלב מול התמלול המקורי. תוכן שנוסח בעזרת הכלי נבדק, נערך ותוקן על ידי הסטודנטיות באחריותן.</w:t>
+      </w:r>
+    </w:p>
+    <w:p>
+      <w:pPr>
+        <w:bidi/>
+        <w:spacing w:after="240" w:line="300" w:lineRule="auto"/>
+        <w:jc w:val="right"/>
+      </w:pPr>
+      <w:r>
+        <w:rPr>
+          <w:rFonts w:ascii="David" w:cs="David" w:eastAsia="David" w:hAnsi="David"/>
+          <w:b w:val="false"/>
+          <w:sz w:val="24"/>
+          <w:szCs w:val="24"/>
+          <w:rtl/>
+        </w:rPr>
+        <w:t xml:space="preserve">______________________________________________________________________</w:t>
+      </w:r>
+    </w:p>
+    <w:p>
+      <w:pPr>
+        <w:bidi/>
+        <w:spacing w:after="240" w:line="300" w:lineRule="auto"/>
+        <w:jc w:val="right"/>
+      </w:pPr>
+      <w:r>
+        <w:rPr>
+          <w:rFonts w:ascii="David" w:cs="David" w:eastAsia="David" w:hAnsi="David"/>
+          <w:b w:val="false"/>
+          <w:sz w:val="24"/>
+          <w:szCs w:val="24"/>
+          <w:rtl/>
+        </w:rPr>
+        <w:t xml:space="preserve">אני מצהירה כי המידע לעיל מדויק, וכל שימוש בכלי בינה מלאכותית נעשה תוך הקפדה על שקיפות, הגינות אקדמית, ובאחריות אישית.</w:t>
+      </w:r>
+    </w:p>
+    <w:p>
+      <w:pPr>
+        <w:bidi/>
+        <w:spacing w:after="120" w:line="300" w:lineRule="auto"/>
+        <w:jc w:val="right"/>
+      </w:pPr>
+      <w:r>
+        <w:rPr>
+          <w:rFonts w:ascii="David" w:cs="David" w:eastAsia="David" w:hAnsi="David"/>
+          <w:b w:val="false"/>
+          <w:sz w:val="24"/>
+          <w:szCs w:val="24"/>
+          <w:rtl/>
+        </w:rPr>
+        <w:t xml:space="preserve">חתימת הסטודנטיות: __________________     __________________     תאריך: _______________</w:t>
       </w:r>
     </w:p>
     <w:sectPr>

</xml_diff>

<commit_message>
Set Al-Qasemi Academy as the institution on the seminar title page
Co-Authored-By: Claude Fable 5 <noreply@anthropic.com>
Claude-Session: https://claude.ai/code/session_01SLEdWJeTzqGJbSWTzfumWY
</commit_message>
<xml_diff>
--- a/seminar-play/سمينار - فاعلية اللعب الجماعي لدى أطفال الروضة.docx
+++ b/seminar-play/سمينار - فاعلية اللعب الجماعي لدى أطفال الروضة.docx
@@ -4,9 +4,49 @@
   <w:body>
     <w:p>
       <w:pPr>
-        <w:bidi/>
-        <w:spacing w:after="120" w:line="360" w:lineRule="auto"/>
-      </w:pPr>
+        <w:spacing w:after="200"/>
+        <w:jc w:val="center"/>
+      </w:pPr>
+      <w:r>
+        <w:drawing>
+          <wp:inline distT="0" distB="0" distL="0" distR="0">
+            <wp:extent cx="1285875" cy="1285875"/>
+            <wp:effectExtent t="0" r="0" b="0" l="0"/>
+            <wp:docPr id="1" name="" descr="" title=""/>
+            <wp:cNvGraphicFramePr>
+              <a:graphicFrameLocks xmlns:a="http://schemas.openxmlformats.org/drawingml/2006/main" noChangeAspect="1"/>
+            </wp:cNvGraphicFramePr>
+            <a:graphic xmlns:a="http://schemas.openxmlformats.org/drawingml/2006/main">
+              <a:graphicData uri="http://schemas.openxmlformats.org/drawingml/2006/picture">
+                <pic:pic xmlns:pic="http://schemas.openxmlformats.org/drawingml/2006/picture">
+                  <pic:nvPicPr>
+                    <pic:cNvPr id="0" name="" descr=""/>
+                    <pic:cNvPicPr>
+                      <a:picLocks noChangeAspect="1" noChangeArrowheads="1"/>
+                    </pic:cNvPicPr>
+                  </pic:nvPicPr>
+                  <pic:blipFill>
+                    <a:blip r:embed="rId7" cstate="none"/>
+                    <a:srcRect/>
+                    <a:stretch>
+                      <a:fillRect/>
+                    </a:stretch>
+                  </pic:blipFill>
+                  <pic:spPr bwMode="auto">
+                    <a:xfrm>
+                      <a:off x="0" y="0"/>
+                      <a:ext cx="1285875" cy="1285875"/>
+                    </a:xfrm>
+                    <a:prstGeom prst="rect">
+                      <a:avLst/>
+                    </a:prstGeom>
+                  </pic:spPr>
+                </pic:pic>
+              </a:graphicData>
+            </a:graphic>
+          </wp:inline>
+        </w:drawing>
+      </w:r>
     </w:p>
     <w:p>
       <w:pPr>
@@ -23,7 +63,7 @@
           <w:szCs w:val="32"/>
           <w:rtl/>
         </w:rPr>
-        <w:t xml:space="preserve">الكلية الأكاديمية أحفا</w:t>
+        <w:t xml:space="preserve">أكاديمية القاسمي</w:t>
       </w:r>
     </w:p>
     <w:p>
@@ -40,7 +80,24 @@
           <w:szCs w:val="28"/>
           <w:rtl/>
         </w:rPr>
-        <w:t xml:space="preserve">قسم التربية</w:t>
+        <w:t xml:space="preserve">كلية أكاديمية للتربية، باقة الغربية</w:t>
+      </w:r>
+    </w:p>
+    <w:p>
+      <w:pPr>
+        <w:bidi/>
+        <w:spacing w:after="120" w:line="360" w:lineRule="auto"/>
+        <w:jc w:val="center"/>
+      </w:pPr>
+      <w:r>
+        <w:rPr>
+          <w:rFonts w:ascii="Simplified Arabic" w:cs="Simplified Arabic" w:eastAsia="Simplified Arabic" w:hAnsi="Simplified Arabic"/>
+          <w:b w:val="false"/>
+          <w:sz w:val="28"/>
+          <w:szCs w:val="28"/>
+          <w:rtl/>
+        </w:rPr>
+        <w:t xml:space="preserve">قسم التربية للطفولة المبكرة</w:t>
       </w:r>
     </w:p>
     <w:p>

</xml_diff>

<commit_message>
Replace static index with an automatic Word TOC field
Headings now use built-in Heading1-3 styles, and the document requests a
field update on open.

Co-Authored-By: Claude Fable 5 <noreply@anthropic.com>
Claude-Session: https://claude.ai/code/session_01SLEdWJeTzqGJbSWTzfumWY
</commit_message>
<xml_diff>
--- a/seminar-play/سمينار - فاعلية اللعب الجماعي لدى أطفال الروضة.docx
+++ b/seminar-play/سمينار - فاعلية اللعب الجماعي لدى أطفال الروضة.docx
@@ -324,453 +324,84 @@
           <w:szCs w:val="28"/>
           <w:rtl/>
         </w:rPr>
-        <w:t xml:space="preserve">ملخص الدراسة</w:t>
-      </w:r>
-    </w:p>
-    <w:p>
-      <w:pPr>
-        <w:bidi/>
-        <w:spacing w:after="120" w:line="360" w:lineRule="auto"/>
-        <w:jc w:val="both"/>
-      </w:pPr>
-      <w:r>
-        <w:rPr>
-          <w:rFonts w:ascii="Simplified Arabic" w:cs="Simplified Arabic" w:eastAsia="Simplified Arabic" w:hAnsi="Simplified Arabic"/>
-          <w:b w:val="false"/>
-          <w:sz w:val="28"/>
-          <w:szCs w:val="28"/>
-          <w:rtl/>
-        </w:rPr>
-        <w:t xml:space="preserve">أولاً: المقدمة</w:t>
-      </w:r>
-    </w:p>
-    <w:p>
-      <w:pPr>
-        <w:bidi/>
-        <w:spacing w:after="120" w:line="360" w:lineRule="auto"/>
-        <w:jc w:val="both"/>
-      </w:pPr>
-      <w:r>
-        <w:rPr>
-          <w:rFonts w:ascii="Simplified Arabic" w:cs="Simplified Arabic" w:eastAsia="Simplified Arabic" w:hAnsi="Simplified Arabic"/>
-          <w:b w:val="false"/>
-          <w:sz w:val="28"/>
-          <w:szCs w:val="28"/>
-          <w:rtl/>
-        </w:rPr>
-        <w:t xml:space="preserve">ثانياً: مشكلة البحث وأسئلته وأهدافه</w:t>
-      </w:r>
-    </w:p>
-    <w:p>
-      <w:pPr>
-        <w:bidi/>
-        <w:spacing w:after="120" w:line="360" w:lineRule="auto"/>
-        <w:jc w:val="both"/>
-      </w:pPr>
-      <w:r>
-        <w:rPr>
-          <w:rFonts w:ascii="Simplified Arabic" w:cs="Simplified Arabic" w:eastAsia="Simplified Arabic" w:hAnsi="Simplified Arabic"/>
-          <w:b w:val="false"/>
-          <w:sz w:val="28"/>
-          <w:szCs w:val="28"/>
-          <w:rtl/>
-        </w:rPr>
-        <w:t xml:space="preserve">ثالثاً: الإطار النظري</w:t>
-      </w:r>
-    </w:p>
-    <w:p>
-      <w:pPr>
-        <w:bidi/>
-        <w:spacing w:after="120" w:line="360" w:lineRule="auto"/>
-        <w:jc w:val="both"/>
-      </w:pPr>
-      <w:r>
-        <w:rPr>
-          <w:rFonts w:ascii="Simplified Arabic" w:cs="Simplified Arabic" w:eastAsia="Simplified Arabic" w:hAnsi="Simplified Arabic"/>
-          <w:b w:val="false"/>
-          <w:sz w:val="28"/>
-          <w:szCs w:val="28"/>
-          <w:rtl/>
-        </w:rPr>
-        <w:t xml:space="preserve">مرحلة الطفولة المبكرة وأهميتها</w:t>
-      </w:r>
-    </w:p>
-    <w:p>
-      <w:pPr>
-        <w:bidi/>
-        <w:spacing w:after="120" w:line="360" w:lineRule="auto"/>
-        <w:jc w:val="both"/>
-      </w:pPr>
-      <w:r>
-        <w:rPr>
-          <w:rFonts w:ascii="Simplified Arabic" w:cs="Simplified Arabic" w:eastAsia="Simplified Arabic" w:hAnsi="Simplified Arabic"/>
-          <w:b w:val="false"/>
-          <w:sz w:val="28"/>
-          <w:szCs w:val="28"/>
-          <w:rtl/>
-        </w:rPr>
-        <w:t xml:space="preserve">خصائص النمو في مرحلة الطفولة المبكرة والفروق بين الأعمار</w:t>
-      </w:r>
-    </w:p>
-    <w:p>
-      <w:pPr>
-        <w:bidi/>
-        <w:spacing w:after="120" w:line="360" w:lineRule="auto"/>
-        <w:jc w:val="both"/>
-      </w:pPr>
-      <w:r>
-        <w:rPr>
-          <w:rFonts w:ascii="Simplified Arabic" w:cs="Simplified Arabic" w:eastAsia="Simplified Arabic" w:hAnsi="Simplified Arabic"/>
-          <w:b w:val="false"/>
-          <w:sz w:val="28"/>
-          <w:szCs w:val="28"/>
-          <w:rtl/>
-        </w:rPr>
-        <w:t xml:space="preserve">المهارات الاجتماعية النفسية ومفهومها</w:t>
-      </w:r>
-    </w:p>
-    <w:p>
-      <w:pPr>
-        <w:bidi/>
-        <w:spacing w:after="120" w:line="360" w:lineRule="auto"/>
-        <w:jc w:val="both"/>
-      </w:pPr>
-      <w:r>
-        <w:rPr>
-          <w:rFonts w:ascii="Simplified Arabic" w:cs="Simplified Arabic" w:eastAsia="Simplified Arabic" w:hAnsi="Simplified Arabic"/>
-          <w:b w:val="false"/>
-          <w:sz w:val="28"/>
-          <w:szCs w:val="28"/>
-          <w:rtl/>
-        </w:rPr>
-        <w:t xml:space="preserve">اللعب الجماعي وأنواعه</w:t>
-      </w:r>
-    </w:p>
-    <w:p>
-      <w:pPr>
-        <w:bidi/>
-        <w:spacing w:after="120" w:line="360" w:lineRule="auto"/>
-        <w:jc w:val="both"/>
-      </w:pPr>
-      <w:r>
-        <w:rPr>
-          <w:rFonts w:ascii="Simplified Arabic" w:cs="Simplified Arabic" w:eastAsia="Simplified Arabic" w:hAnsi="Simplified Arabic"/>
-          <w:b w:val="false"/>
-          <w:sz w:val="28"/>
-          <w:szCs w:val="28"/>
-          <w:rtl/>
-        </w:rPr>
-        <w:t xml:space="preserve">دور المعلمة في توظيف اللعب الجماعي</w:t>
-      </w:r>
-    </w:p>
-    <w:p>
-      <w:pPr>
-        <w:bidi/>
-        <w:spacing w:after="120" w:line="360" w:lineRule="auto"/>
-        <w:jc w:val="both"/>
-      </w:pPr>
-      <w:r>
-        <w:rPr>
-          <w:rFonts w:ascii="Simplified Arabic" w:cs="Simplified Arabic" w:eastAsia="Simplified Arabic" w:hAnsi="Simplified Arabic"/>
-          <w:b w:val="false"/>
-          <w:sz w:val="28"/>
-          <w:szCs w:val="28"/>
-          <w:rtl/>
-        </w:rPr>
-        <w:t xml:space="preserve">اللعب ودمج الأطفال ذوي الاحتياجات الخاصة</w:t>
-      </w:r>
-    </w:p>
-    <w:p>
-      <w:pPr>
-        <w:bidi/>
-        <w:spacing w:after="120" w:line="360" w:lineRule="auto"/>
-        <w:jc w:val="both"/>
-      </w:pPr>
-      <w:r>
-        <w:rPr>
-          <w:rFonts w:ascii="Simplified Arabic" w:cs="Simplified Arabic" w:eastAsia="Simplified Arabic" w:hAnsi="Simplified Arabic"/>
-          <w:b w:val="false"/>
-          <w:sz w:val="28"/>
-          <w:szCs w:val="28"/>
-          <w:rtl/>
-        </w:rPr>
-        <w:t xml:space="preserve">السياق البيئي: البيت والروضة والمجتمع المحلي</w:t>
-      </w:r>
-    </w:p>
-    <w:p>
-      <w:pPr>
-        <w:bidi/>
-        <w:spacing w:after="120" w:line="360" w:lineRule="auto"/>
-        <w:jc w:val="both"/>
-      </w:pPr>
-      <w:r>
-        <w:rPr>
-          <w:rFonts w:ascii="Simplified Arabic" w:cs="Simplified Arabic" w:eastAsia="Simplified Arabic" w:hAnsi="Simplified Arabic"/>
-          <w:b w:val="false"/>
-          <w:sz w:val="28"/>
-          <w:szCs w:val="28"/>
-          <w:rtl/>
-        </w:rPr>
-        <w:t xml:space="preserve">رابعاً: الدراسات السابقة</w:t>
-      </w:r>
-    </w:p>
-    <w:p>
-      <w:pPr>
-        <w:bidi/>
-        <w:spacing w:after="120" w:line="360" w:lineRule="auto"/>
-        <w:jc w:val="both"/>
-      </w:pPr>
-      <w:r>
-        <w:rPr>
-          <w:rFonts w:ascii="Simplified Arabic" w:cs="Simplified Arabic" w:eastAsia="Simplified Arabic" w:hAnsi="Simplified Arabic"/>
-          <w:b w:val="false"/>
-          <w:sz w:val="28"/>
-          <w:szCs w:val="28"/>
-          <w:rtl/>
-        </w:rPr>
-        <w:t xml:space="preserve">خامساً: منهجية البحث</w:t>
-      </w:r>
-    </w:p>
-    <w:p>
-      <w:pPr>
-        <w:bidi/>
-        <w:spacing w:after="120" w:line="360" w:lineRule="auto"/>
-        <w:jc w:val="both"/>
-      </w:pPr>
-      <w:r>
-        <w:rPr>
-          <w:rFonts w:ascii="Simplified Arabic" w:cs="Simplified Arabic" w:eastAsia="Simplified Arabic" w:hAnsi="Simplified Arabic"/>
-          <w:b w:val="false"/>
-          <w:sz w:val="28"/>
-          <w:szCs w:val="28"/>
-          <w:rtl/>
-        </w:rPr>
-        <w:t xml:space="preserve">المنهج البحثي</w:t>
-      </w:r>
-    </w:p>
-    <w:p>
-      <w:pPr>
-        <w:bidi/>
-        <w:spacing w:after="120" w:line="360" w:lineRule="auto"/>
-        <w:jc w:val="both"/>
-      </w:pPr>
-      <w:r>
-        <w:rPr>
-          <w:rFonts w:ascii="Simplified Arabic" w:cs="Simplified Arabic" w:eastAsia="Simplified Arabic" w:hAnsi="Simplified Arabic"/>
-          <w:b w:val="false"/>
-          <w:sz w:val="28"/>
-          <w:szCs w:val="28"/>
-          <w:rtl/>
-        </w:rPr>
-        <w:t xml:space="preserve">مجتمع البحث والمشاركات</w:t>
-      </w:r>
-    </w:p>
-    <w:p>
-      <w:pPr>
-        <w:bidi/>
-        <w:spacing w:after="120" w:line="360" w:lineRule="auto"/>
-        <w:jc w:val="both"/>
-      </w:pPr>
-      <w:r>
-        <w:rPr>
-          <w:rFonts w:ascii="Simplified Arabic" w:cs="Simplified Arabic" w:eastAsia="Simplified Arabic" w:hAnsi="Simplified Arabic"/>
-          <w:b w:val="false"/>
-          <w:sz w:val="28"/>
-          <w:szCs w:val="28"/>
-          <w:rtl/>
-        </w:rPr>
-        <w:t xml:space="preserve">أداة جمع البيانات</w:t>
-      </w:r>
-    </w:p>
-    <w:p>
-      <w:pPr>
-        <w:bidi/>
-        <w:spacing w:after="120" w:line="360" w:lineRule="auto"/>
-        <w:jc w:val="both"/>
-      </w:pPr>
-      <w:r>
-        <w:rPr>
-          <w:rFonts w:ascii="Simplified Arabic" w:cs="Simplified Arabic" w:eastAsia="Simplified Arabic" w:hAnsi="Simplified Arabic"/>
-          <w:b w:val="false"/>
-          <w:sz w:val="28"/>
-          <w:szCs w:val="28"/>
-          <w:rtl/>
-        </w:rPr>
-        <w:t xml:space="preserve">إجراءات البحث</w:t>
-      </w:r>
-    </w:p>
-    <w:p>
-      <w:pPr>
-        <w:bidi/>
-        <w:spacing w:after="120" w:line="360" w:lineRule="auto"/>
-        <w:jc w:val="both"/>
-      </w:pPr>
-      <w:r>
-        <w:rPr>
-          <w:rFonts w:ascii="Simplified Arabic" w:cs="Simplified Arabic" w:eastAsia="Simplified Arabic" w:hAnsi="Simplified Arabic"/>
-          <w:b w:val="false"/>
-          <w:sz w:val="28"/>
-          <w:szCs w:val="28"/>
-          <w:rtl/>
-        </w:rPr>
-        <w:t xml:space="preserve">تحليل البيانات</w:t>
-      </w:r>
-    </w:p>
-    <w:p>
-      <w:pPr>
-        <w:bidi/>
-        <w:spacing w:after="120" w:line="360" w:lineRule="auto"/>
-        <w:jc w:val="both"/>
-      </w:pPr>
-      <w:r>
-        <w:rPr>
-          <w:rFonts w:ascii="Simplified Arabic" w:cs="Simplified Arabic" w:eastAsia="Simplified Arabic" w:hAnsi="Simplified Arabic"/>
-          <w:b w:val="false"/>
-          <w:sz w:val="28"/>
-          <w:szCs w:val="28"/>
-          <w:rtl/>
-        </w:rPr>
-        <w:t xml:space="preserve">أخلاقيات البحث</w:t>
-      </w:r>
-    </w:p>
-    <w:p>
-      <w:pPr>
-        <w:bidi/>
-        <w:spacing w:after="120" w:line="360" w:lineRule="auto"/>
-        <w:jc w:val="both"/>
-      </w:pPr>
-      <w:r>
-        <w:rPr>
-          <w:rFonts w:ascii="Simplified Arabic" w:cs="Simplified Arabic" w:eastAsia="Simplified Arabic" w:hAnsi="Simplified Arabic"/>
-          <w:b w:val="false"/>
-          <w:sz w:val="28"/>
-          <w:szCs w:val="28"/>
-          <w:rtl/>
-        </w:rPr>
-        <w:t xml:space="preserve">مصداقية البحث ومحدوديته</w:t>
-      </w:r>
-    </w:p>
-    <w:p>
-      <w:pPr>
-        <w:bidi/>
-        <w:spacing w:after="120" w:line="360" w:lineRule="auto"/>
-        <w:jc w:val="both"/>
-      </w:pPr>
-      <w:r>
-        <w:rPr>
-          <w:rFonts w:ascii="Simplified Arabic" w:cs="Simplified Arabic" w:eastAsia="Simplified Arabic" w:hAnsi="Simplified Arabic"/>
-          <w:b w:val="false"/>
-          <w:sz w:val="28"/>
-          <w:szCs w:val="28"/>
-          <w:rtl/>
-        </w:rPr>
-        <w:t xml:space="preserve">سادساً: نتائج البحث</w:t>
-      </w:r>
-    </w:p>
-    <w:p>
-      <w:pPr>
-        <w:bidi/>
-        <w:spacing w:after="120" w:line="360" w:lineRule="auto"/>
-        <w:jc w:val="both"/>
-      </w:pPr>
-      <w:r>
-        <w:rPr>
-          <w:rFonts w:ascii="Simplified Arabic" w:cs="Simplified Arabic" w:eastAsia="Simplified Arabic" w:hAnsi="Simplified Arabic"/>
-          <w:b w:val="false"/>
-          <w:sz w:val="28"/>
-          <w:szCs w:val="28"/>
-          <w:rtl/>
-        </w:rPr>
-        <w:t xml:space="preserve">سابعاً: مناقشة النتائج</w:t>
-      </w:r>
-    </w:p>
-    <w:p>
-      <w:pPr>
-        <w:bidi/>
-        <w:spacing w:after="120" w:line="360" w:lineRule="auto"/>
-        <w:jc w:val="both"/>
-      </w:pPr>
-      <w:r>
-        <w:rPr>
-          <w:rFonts w:ascii="Simplified Arabic" w:cs="Simplified Arabic" w:eastAsia="Simplified Arabic" w:hAnsi="Simplified Arabic"/>
-          <w:b w:val="false"/>
-          <w:sz w:val="28"/>
-          <w:szCs w:val="28"/>
-          <w:rtl/>
-        </w:rPr>
-        <w:t xml:space="preserve">ثامناً: الاستنتاجات والتوصيات</w:t>
-      </w:r>
-    </w:p>
-    <w:p>
-      <w:pPr>
-        <w:bidi/>
-        <w:spacing w:after="120" w:line="360" w:lineRule="auto"/>
-        <w:jc w:val="both"/>
-      </w:pPr>
-      <w:r>
-        <w:rPr>
-          <w:rFonts w:ascii="Simplified Arabic" w:cs="Simplified Arabic" w:eastAsia="Simplified Arabic" w:hAnsi="Simplified Arabic"/>
-          <w:b w:val="false"/>
-          <w:sz w:val="28"/>
-          <w:szCs w:val="28"/>
-          <w:rtl/>
-        </w:rPr>
-        <w:t xml:space="preserve">تاسعاً: انعكاسية الباحثتين</w:t>
-      </w:r>
-    </w:p>
-    <w:p>
-      <w:pPr>
-        <w:bidi/>
-        <w:spacing w:after="120" w:line="360" w:lineRule="auto"/>
-        <w:jc w:val="both"/>
-      </w:pPr>
-      <w:r>
-        <w:rPr>
-          <w:rFonts w:ascii="Simplified Arabic" w:cs="Simplified Arabic" w:eastAsia="Simplified Arabic" w:hAnsi="Simplified Arabic"/>
-          <w:b w:val="false"/>
-          <w:sz w:val="28"/>
-          <w:szCs w:val="28"/>
-          <w:rtl/>
-        </w:rPr>
-        <w:t xml:space="preserve">قائمة المراجع</w:t>
-      </w:r>
-    </w:p>
-    <w:p>
-      <w:pPr>
-        <w:bidi/>
-        <w:spacing w:after="120" w:line="360" w:lineRule="auto"/>
-        <w:jc w:val="both"/>
-      </w:pPr>
-      <w:r>
-        <w:rPr>
-          <w:rFonts w:ascii="Simplified Arabic" w:cs="Simplified Arabic" w:eastAsia="Simplified Arabic" w:hAnsi="Simplified Arabic"/>
-          <w:b w:val="false"/>
-          <w:sz w:val="28"/>
-          <w:szCs w:val="28"/>
-          <w:rtl/>
-        </w:rPr>
-        <w:t xml:space="preserve">الملاحق</w:t>
-      </w:r>
-    </w:p>
-    <w:p>
-      <w:pPr>
-        <w:bidi/>
-        <w:spacing w:after="120" w:line="360" w:lineRule="auto"/>
-        <w:jc w:val="both"/>
-      </w:pPr>
-      <w:r>
-        <w:rPr>
-          <w:rFonts w:ascii="Simplified Arabic" w:cs="Simplified Arabic" w:eastAsia="Simplified Arabic" w:hAnsi="Simplified Arabic"/>
-          <w:b w:val="false"/>
-          <w:sz w:val="28"/>
-          <w:szCs w:val="28"/>
-          <w:rtl/>
-        </w:rPr>
-        <w:t xml:space="preserve">טופס הצהרה על שימוש בבינה מלאכותית (עמוד נפרד)</w:t>
-      </w:r>
-    </w:p>
-    <w:p>
-      <w:pPr>
+        <w:t xml:space="preserve">ملاحظة: جدول المحتويات أدناه آلي. لتحديثه بعد أيّ تعديل، اضغط داخله ثمّ </w:t>
+      </w:r>
+      <w:r>
+        <w:rPr>
+          <w:rFonts w:ascii="Times New Roman" w:cs="Times New Roman" w:eastAsia="Times New Roman" w:hAnsi="Times New Roman"/>
+          <w:b w:val="false"/>
+          <w:sz w:val="28"/>
+          <w:szCs w:val="28"/>
+        </w:rPr>
+        <w:t xml:space="preserve">F9 </w:t>
+      </w:r>
+      <w:r>
+        <w:rPr>
+          <w:rFonts w:ascii="Simplified Arabic" w:cs="Simplified Arabic" w:eastAsia="Simplified Arabic" w:hAnsi="Simplified Arabic"/>
+          <w:b w:val="false"/>
+          <w:sz w:val="28"/>
+          <w:szCs w:val="28"/>
+          <w:rtl/>
+        </w:rPr>
+        <w:t xml:space="preserve">واختر تحديث الجدول بأكمله، أو حدّد المستند كلّه بـ </w:t>
+      </w:r>
+      <w:r>
+        <w:rPr>
+          <w:rFonts w:ascii="Times New Roman" w:cs="Times New Roman" w:eastAsia="Times New Roman" w:hAnsi="Times New Roman"/>
+          <w:b w:val="false"/>
+          <w:sz w:val="28"/>
+          <w:szCs w:val="28"/>
+        </w:rPr>
+        <w:t xml:space="preserve">Ctrl+A </w:t>
+      </w:r>
+      <w:r>
+        <w:rPr>
+          <w:rFonts w:ascii="Simplified Arabic" w:cs="Simplified Arabic" w:eastAsia="Simplified Arabic" w:hAnsi="Simplified Arabic"/>
+          <w:b w:val="false"/>
+          <w:sz w:val="28"/>
+          <w:szCs w:val="28"/>
+          <w:rtl/>
+        </w:rPr>
+        <w:t xml:space="preserve">ثمّ اضغط </w:t>
+      </w:r>
+      <w:r>
+        <w:rPr>
+          <w:rFonts w:ascii="Times New Roman" w:cs="Times New Roman" w:eastAsia="Times New Roman" w:hAnsi="Times New Roman"/>
+          <w:b w:val="false"/>
+          <w:sz w:val="28"/>
+          <w:szCs w:val="28"/>
+        </w:rPr>
+        <w:t xml:space="preserve">F9.</w:t>
+      </w:r>
+    </w:p>
+    <w:p>
+      <w:pPr>
+        <w:bidi/>
+        <w:spacing w:after="120" w:line="360" w:lineRule="auto"/>
+      </w:pPr>
+    </w:p>
+    <w:sdt>
+      <w:sdtPr>
+        <w:alias w:val="جدول المحتويات"/>
+      </w:sdtPr>
+      <w:sdtContent>
+        <w:p>
+          <w:r>
+            <w:fldChar w:fldCharType="begin" w:dirty="true"/>
+            <w:instrText xml:space="preserve">TOC \h \o "1-3"</w:instrText>
+            <w:fldChar w:fldCharType="separate"/>
+          </w:r>
+        </w:p>
+        <w:p>
+          <w:r>
+            <w:fldChar w:fldCharType="end"/>
+          </w:r>
+        </w:p>
+      </w:sdtContent>
+    </w:sdt>
+    <w:p>
+      <w:pPr>
+        <w:pStyle w:val="Heading1"/>
         <w:pageBreakBefore/>
         <w:bidi/>
         <w:spacing w:after="240" w:line="360" w:lineRule="auto"/>
@@ -850,6 +481,7 @@
     </w:p>
     <w:p>
       <w:pPr>
+        <w:pStyle w:val="Heading1"/>
         <w:pageBreakBefore/>
         <w:bidi/>
         <w:spacing w:after="240" w:line="360" w:lineRule="auto"/>
@@ -984,6 +616,7 @@
     </w:p>
     <w:p>
       <w:pPr>
+        <w:pStyle w:val="Heading1"/>
         <w:pageBreakBefore/>
         <w:bidi/>
         <w:spacing w:after="240" w:line="360" w:lineRule="auto"/>
@@ -1003,6 +636,7 @@
     </w:p>
     <w:p>
       <w:pPr>
+        <w:pStyle w:val="Heading2"/>
         <w:bidi/>
         <w:spacing w:after="160" w:line="360" w:lineRule="auto"/>
         <w:jc w:val="right"/>
@@ -1055,6 +689,7 @@
     </w:p>
     <w:p>
       <w:pPr>
+        <w:pStyle w:val="Heading2"/>
         <w:bidi/>
         <w:spacing w:after="160" w:line="360" w:lineRule="auto"/>
         <w:jc w:val="right"/>
@@ -1141,6 +776,7 @@
     </w:p>
     <w:p>
       <w:pPr>
+        <w:pStyle w:val="Heading2"/>
         <w:bidi/>
         <w:spacing w:after="160" w:line="360" w:lineRule="auto"/>
         <w:jc w:val="right"/>
@@ -1227,6 +863,7 @@
     </w:p>
     <w:p>
       <w:pPr>
+        <w:pStyle w:val="Heading2"/>
         <w:bidi/>
         <w:spacing w:after="160" w:line="360" w:lineRule="auto"/>
         <w:jc w:val="right"/>
@@ -1262,6 +899,7 @@
     </w:p>
     <w:p>
       <w:pPr>
+        <w:pStyle w:val="Heading1"/>
         <w:pageBreakBefore/>
         <w:bidi/>
         <w:spacing w:after="240" w:line="360" w:lineRule="auto"/>
@@ -1281,6 +919,7 @@
     </w:p>
     <w:p>
       <w:pPr>
+        <w:pStyle w:val="Heading2"/>
         <w:bidi/>
         <w:spacing w:after="160" w:line="360" w:lineRule="auto"/>
         <w:jc w:val="right"/>
@@ -1350,6 +989,7 @@
     </w:p>
     <w:p>
       <w:pPr>
+        <w:pStyle w:val="Heading2"/>
         <w:bidi/>
         <w:spacing w:after="160" w:line="360" w:lineRule="auto"/>
         <w:jc w:val="right"/>
@@ -1495,6 +1135,7 @@
     </w:p>
     <w:p>
       <w:pPr>
+        <w:pStyle w:val="Heading2"/>
         <w:bidi/>
         <w:spacing w:after="160" w:line="360" w:lineRule="auto"/>
         <w:jc w:val="right"/>
@@ -1564,6 +1205,7 @@
     </w:p>
     <w:p>
       <w:pPr>
+        <w:pStyle w:val="Heading2"/>
         <w:bidi/>
         <w:spacing w:after="160" w:line="360" w:lineRule="auto"/>
         <w:jc w:val="right"/>
@@ -1678,6 +1320,7 @@
     </w:p>
     <w:p>
       <w:pPr>
+        <w:pStyle w:val="Heading2"/>
         <w:bidi/>
         <w:spacing w:after="160" w:line="360" w:lineRule="auto"/>
         <w:jc w:val="right"/>
@@ -1747,6 +1390,7 @@
     </w:p>
     <w:p>
       <w:pPr>
+        <w:pStyle w:val="Heading2"/>
         <w:bidi/>
         <w:spacing w:after="160" w:line="360" w:lineRule="auto"/>
         <w:jc w:val="right"/>
@@ -1835,6 +1479,7 @@
     </w:p>
     <w:p>
       <w:pPr>
+        <w:pStyle w:val="Heading2"/>
         <w:bidi/>
         <w:spacing w:after="160" w:line="360" w:lineRule="auto"/>
         <w:jc w:val="right"/>
@@ -1925,6 +1570,7 @@
     </w:p>
     <w:p>
       <w:pPr>
+        <w:pStyle w:val="Heading1"/>
         <w:pageBreakBefore/>
         <w:bidi/>
         <w:spacing w:after="240" w:line="360" w:lineRule="auto"/>
@@ -1961,6 +1607,7 @@
     </w:p>
     <w:p>
       <w:pPr>
+        <w:pStyle w:val="Heading2"/>
         <w:bidi/>
         <w:spacing w:after="160" w:line="360" w:lineRule="auto"/>
         <w:jc w:val="right"/>
@@ -2047,6 +1694,7 @@
     </w:p>
     <w:p>
       <w:pPr>
+        <w:pStyle w:val="Heading2"/>
         <w:bidi/>
         <w:spacing w:after="160" w:line="360" w:lineRule="auto"/>
         <w:jc w:val="right"/>
@@ -2194,6 +1842,7 @@
     </w:p>
     <w:p>
       <w:pPr>
+        <w:pStyle w:val="Heading2"/>
         <w:bidi/>
         <w:spacing w:after="160" w:line="360" w:lineRule="auto"/>
         <w:jc w:val="right"/>
@@ -2229,6 +1878,7 @@
     </w:p>
     <w:p>
       <w:pPr>
+        <w:pStyle w:val="Heading1"/>
         <w:pageBreakBefore/>
         <w:bidi/>
         <w:spacing w:after="240" w:line="360" w:lineRule="auto"/>
@@ -2248,6 +1898,7 @@
     </w:p>
     <w:p>
       <w:pPr>
+        <w:pStyle w:val="Heading2"/>
         <w:bidi/>
         <w:spacing w:after="160" w:line="360" w:lineRule="auto"/>
         <w:jc w:val="right"/>
@@ -2300,6 +1951,7 @@
     </w:p>
     <w:p>
       <w:pPr>
+        <w:pStyle w:val="Heading2"/>
         <w:bidi/>
         <w:spacing w:after="160" w:line="360" w:lineRule="auto"/>
         <w:jc w:val="right"/>
@@ -3359,6 +3011,7 @@
     </w:p>
     <w:p>
       <w:pPr>
+        <w:pStyle w:val="Heading2"/>
         <w:bidi/>
         <w:spacing w:after="160" w:line="360" w:lineRule="auto"/>
         <w:jc w:val="right"/>
@@ -3437,6 +3090,7 @@
     </w:p>
     <w:p>
       <w:pPr>
+        <w:pStyle w:val="Heading2"/>
         <w:bidi/>
         <w:spacing w:after="160" w:line="360" w:lineRule="auto"/>
         <w:jc w:val="right"/>
@@ -3506,6 +3160,7 @@
     </w:p>
     <w:p>
       <w:pPr>
+        <w:pStyle w:val="Heading2"/>
         <w:bidi/>
         <w:spacing w:after="160" w:line="360" w:lineRule="auto"/>
         <w:jc w:val="right"/>
@@ -3594,6 +3249,7 @@
     </w:p>
     <w:p>
       <w:pPr>
+        <w:pStyle w:val="Heading2"/>
         <w:bidi/>
         <w:spacing w:after="160" w:line="360" w:lineRule="auto"/>
         <w:jc w:val="right"/>
@@ -3680,6 +3336,7 @@
     </w:p>
     <w:p>
       <w:pPr>
+        <w:pStyle w:val="Heading2"/>
         <w:bidi/>
         <w:spacing w:after="160" w:line="360" w:lineRule="auto"/>
         <w:jc w:val="right"/>
@@ -3796,6 +3453,7 @@
     </w:p>
     <w:p>
       <w:pPr>
+        <w:pStyle w:val="Heading1"/>
         <w:pageBreakBefore/>
         <w:bidi/>
         <w:spacing w:after="240" w:line="360" w:lineRule="auto"/>
@@ -4623,6 +4281,7 @@
     </w:p>
     <w:p>
       <w:pPr>
+        <w:pStyle w:val="Heading2"/>
         <w:bidi/>
         <w:spacing w:after="160" w:line="360" w:lineRule="auto"/>
         <w:jc w:val="right"/>
@@ -4641,6 +4300,7 @@
     </w:p>
     <w:p>
       <w:pPr>
+        <w:pStyle w:val="Heading3"/>
         <w:bidi/>
         <w:spacing w:after="140" w:line="360" w:lineRule="auto"/>
         <w:jc w:val="right"/>
@@ -4710,6 +4370,7 @@
     </w:p>
     <w:p>
       <w:pPr>
+        <w:pStyle w:val="Heading3"/>
         <w:bidi/>
         <w:spacing w:after="140" w:line="360" w:lineRule="auto"/>
         <w:jc w:val="right"/>
@@ -4796,6 +4457,7 @@
     </w:p>
     <w:p>
       <w:pPr>
+        <w:pStyle w:val="Heading2"/>
         <w:bidi/>
         <w:spacing w:after="160" w:line="360" w:lineRule="auto"/>
         <w:jc w:val="right"/>
@@ -4814,6 +4476,7 @@
     </w:p>
     <w:p>
       <w:pPr>
+        <w:pStyle w:val="Heading3"/>
         <w:bidi/>
         <w:spacing w:after="140" w:line="360" w:lineRule="auto"/>
         <w:jc w:val="right"/>
@@ -4900,6 +4563,7 @@
     </w:p>
     <w:p>
       <w:pPr>
+        <w:pStyle w:val="Heading3"/>
         <w:bidi/>
         <w:spacing w:after="140" w:line="360" w:lineRule="auto"/>
         <w:jc w:val="right"/>
@@ -5003,6 +4667,7 @@
     </w:p>
     <w:p>
       <w:pPr>
+        <w:pStyle w:val="Heading2"/>
         <w:bidi/>
         <w:spacing w:after="160" w:line="360" w:lineRule="auto"/>
         <w:jc w:val="right"/>
@@ -5021,6 +4686,7 @@
     </w:p>
     <w:p>
       <w:pPr>
+        <w:pStyle w:val="Heading3"/>
         <w:bidi/>
         <w:spacing w:after="140" w:line="360" w:lineRule="auto"/>
         <w:jc w:val="right"/>
@@ -5124,6 +4790,7 @@
     </w:p>
     <w:p>
       <w:pPr>
+        <w:pStyle w:val="Heading3"/>
         <w:bidi/>
         <w:spacing w:after="140" w:line="360" w:lineRule="auto"/>
         <w:jc w:val="right"/>
@@ -5210,6 +4877,7 @@
     </w:p>
     <w:p>
       <w:pPr>
+        <w:pStyle w:val="Heading2"/>
         <w:bidi/>
         <w:spacing w:after="160" w:line="360" w:lineRule="auto"/>
         <w:jc w:val="right"/>
@@ -5228,6 +4896,7 @@
     </w:p>
     <w:p>
       <w:pPr>
+        <w:pStyle w:val="Heading3"/>
         <w:bidi/>
         <w:spacing w:after="140" w:line="360" w:lineRule="auto"/>
         <w:jc w:val="right"/>
@@ -5331,6 +5000,7 @@
     </w:p>
     <w:p>
       <w:pPr>
+        <w:pStyle w:val="Heading1"/>
         <w:pageBreakBefore/>
         <w:bidi/>
         <w:spacing w:after="240" w:line="360" w:lineRule="auto"/>
@@ -5696,6 +5366,7 @@
     </w:p>
     <w:p>
       <w:pPr>
+        <w:pStyle w:val="Heading1"/>
         <w:pageBreakBefore/>
         <w:bidi/>
         <w:spacing w:after="240" w:line="360" w:lineRule="auto"/>
@@ -5715,6 +5386,7 @@
     </w:p>
     <w:p>
       <w:pPr>
+        <w:pStyle w:val="Heading2"/>
         <w:bidi/>
         <w:spacing w:after="160" w:line="360" w:lineRule="auto"/>
         <w:jc w:val="right"/>
@@ -5801,6 +5473,7 @@
     </w:p>
     <w:p>
       <w:pPr>
+        <w:pStyle w:val="Heading2"/>
         <w:bidi/>
         <w:spacing w:after="160" w:line="360" w:lineRule="auto"/>
         <w:jc w:val="right"/>
@@ -5904,6 +5577,7 @@
     </w:p>
     <w:p>
       <w:pPr>
+        <w:pStyle w:val="Heading1"/>
         <w:pageBreakBefore/>
         <w:bidi/>
         <w:spacing w:after="240" w:line="360" w:lineRule="auto"/>
@@ -6025,6 +5699,7 @@
     </w:p>
     <w:p>
       <w:pPr>
+        <w:pStyle w:val="Heading1"/>
         <w:pageBreakBefore/>
         <w:bidi/>
         <w:spacing w:after="240" w:line="360" w:lineRule="auto"/>
@@ -6044,6 +5719,7 @@
     </w:p>
     <w:p>
       <w:pPr>
+        <w:pStyle w:val="Heading2"/>
         <w:bidi/>
         <w:spacing w:after="160" w:line="360" w:lineRule="auto"/>
         <w:jc w:val="right"/>
@@ -6332,6 +6008,7 @@
     </w:p>
     <w:p>
       <w:pPr>
+        <w:pStyle w:val="Heading2"/>
         <w:bidi/>
         <w:spacing w:after="160" w:line="360" w:lineRule="auto"/>
         <w:jc w:val="right"/>
@@ -6558,6 +6235,7 @@
     </w:p>
     <w:p>
       <w:pPr>
+        <w:pStyle w:val="Heading2"/>
         <w:bidi/>
         <w:spacing w:after="160" w:line="360" w:lineRule="auto"/>
         <w:jc w:val="right"/>
@@ -6594,6 +6272,7 @@
     </w:p>
     <w:p>
       <w:pPr>
+        <w:pStyle w:val="Heading1"/>
         <w:pageBreakBefore/>
         <w:bidi/>
         <w:spacing w:after="240" w:line="360" w:lineRule="auto"/>
@@ -6613,6 +6292,7 @@
     </w:p>
     <w:p>
       <w:pPr>
+        <w:pStyle w:val="Heading2"/>
         <w:bidi/>
         <w:spacing w:after="160" w:line="360" w:lineRule="auto"/>
         <w:jc w:val="right"/>
@@ -6648,6 +6328,7 @@
     </w:p>
     <w:p>
       <w:pPr>
+        <w:pStyle w:val="Heading3"/>
         <w:bidi/>
         <w:spacing w:after="140" w:line="360" w:lineRule="auto"/>
         <w:jc w:val="right"/>
@@ -6683,6 +6364,7 @@
     </w:p>
     <w:p>
       <w:pPr>
+        <w:pStyle w:val="Heading3"/>
         <w:bidi/>
         <w:spacing w:after="140" w:line="360" w:lineRule="auto"/>
         <w:jc w:val="right"/>
@@ -6769,6 +6451,7 @@
     </w:p>
     <w:p>
       <w:pPr>
+        <w:pStyle w:val="Heading3"/>
         <w:bidi/>
         <w:spacing w:after="140" w:line="360" w:lineRule="auto"/>
         <w:jc w:val="right"/>
@@ -6855,6 +6538,7 @@
     </w:p>
     <w:p>
       <w:pPr>
+        <w:pStyle w:val="Heading3"/>
         <w:bidi/>
         <w:spacing w:after="140" w:line="360" w:lineRule="auto"/>
         <w:jc w:val="right"/>
@@ -6924,6 +6608,7 @@
     </w:p>
     <w:p>
       <w:pPr>
+        <w:pStyle w:val="Heading3"/>
         <w:bidi/>
         <w:spacing w:after="140" w:line="360" w:lineRule="auto"/>
         <w:jc w:val="right"/>
@@ -6993,6 +6678,7 @@
     </w:p>
     <w:p>
       <w:pPr>
+        <w:pStyle w:val="Heading2"/>
         <w:pageBreakBefore/>
         <w:bidi/>
         <w:spacing w:after="160" w:line="360" w:lineRule="auto"/>
@@ -7578,6 +7264,7 @@
     </w:p>
     <w:p>
       <w:pPr>
+        <w:pStyle w:val="Heading2"/>
         <w:pageBreakBefore/>
         <w:bidi/>
         <w:spacing w:after="160" w:line="360" w:lineRule="auto"/>
@@ -8163,6 +7850,7 @@
     </w:p>
     <w:p>
       <w:pPr>
+        <w:pStyle w:val="Heading2"/>
         <w:pageBreakBefore/>
         <w:bidi/>
         <w:spacing w:after="160" w:line="360" w:lineRule="auto"/>
@@ -8748,6 +8436,7 @@
     </w:p>
     <w:p>
       <w:pPr>
+        <w:pStyle w:val="Heading2"/>
         <w:pageBreakBefore/>
         <w:bidi/>
         <w:spacing w:after="160" w:line="360" w:lineRule="auto"/>
@@ -9333,6 +9022,7 @@
     </w:p>
     <w:p>
       <w:pPr>
+        <w:pStyle w:val="Heading2"/>
         <w:pageBreakBefore/>
         <w:bidi/>
         <w:spacing w:after="160" w:line="360" w:lineRule="auto"/>
@@ -9918,6 +9608,7 @@
     </w:p>
     <w:p>
       <w:pPr>
+        <w:pStyle w:val="Heading2"/>
         <w:pageBreakBefore/>
         <w:bidi/>
         <w:spacing w:after="160" w:line="360" w:lineRule="auto"/>
@@ -10503,6 +10194,7 @@
     </w:p>
     <w:p>
       <w:pPr>
+        <w:pStyle w:val="Heading1"/>
         <w:pageBreakBefore/>
         <w:bidi/>
         <w:spacing w:after="240" w:line="300" w:lineRule="auto"/>
@@ -11007,9 +10699,12 @@
     <w:next w:val="Normal"/>
     <w:qFormat/>
     <w:rPr>
-      <w:color w:val="2E74B5"/>
-      <w:sz w:val="32"/>
-      <w:szCs w:val="32"/>
+      <w:rFonts w:ascii="Simplified Arabic" w:cs="Simplified Arabic" w:eastAsia="Simplified Arabic" w:hAnsi="Simplified Arabic"/>
+      <w:b/>
+      <w:bCs/>
+      <w:color w:val="000000"/>
+      <w:sz w:val="34"/>
+      <w:szCs w:val="34"/>
     </w:rPr>
   </w:style>
   <w:style w:type="paragraph" w:styleId="Heading2">
@@ -11018,9 +10713,12 @@
     <w:next w:val="Normal"/>
     <w:qFormat/>
     <w:rPr>
-      <w:color w:val="2E74B5"/>
-      <w:sz w:val="26"/>
-      <w:szCs w:val="26"/>
+      <w:rFonts w:ascii="Simplified Arabic" w:cs="Simplified Arabic" w:eastAsia="Simplified Arabic" w:hAnsi="Simplified Arabic"/>
+      <w:b/>
+      <w:bCs/>
+      <w:color w:val="000000"/>
+      <w:sz w:val="30"/>
+      <w:szCs w:val="30"/>
     </w:rPr>
   </w:style>
   <w:style w:type="paragraph" w:styleId="Heading3">
@@ -11029,9 +10727,12 @@
     <w:next w:val="Normal"/>
     <w:qFormat/>
     <w:rPr>
-      <w:color w:val="1F4D78"/>
-      <w:sz w:val="24"/>
-      <w:szCs w:val="24"/>
+      <w:rFonts w:ascii="Simplified Arabic" w:cs="Simplified Arabic" w:eastAsia="Simplified Arabic" w:hAnsi="Simplified Arabic"/>
+      <w:b/>
+      <w:bCs/>
+      <w:color w:val="000000"/>
+      <w:sz w:val="28"/>
+      <w:szCs w:val="28"/>
     </w:rPr>
   </w:style>
   <w:style w:type="paragraph" w:styleId="Heading4">
@@ -11162,5 +10863,56 @@
       <w:szCs w:val="20"/>
     </w:rPr>
   </w:style>
+  <w:style w:type="paragraph" w:styleId="Heading1">
+    <w:name w:val="Heading 1"/>
+    <w:basedOn w:val="Normal"/>
+    <w:next w:val="Normal"/>
+    <w:qFormat/>
+    <w:pPr>
+      <w:spacing w:after="160" w:before="240"/>
+    </w:pPr>
+    <w:rPr>
+      <w:rFonts w:ascii="Simplified Arabic" w:cs="Simplified Arabic" w:eastAsia="Simplified Arabic" w:hAnsi="Simplified Arabic"/>
+      <w:b/>
+      <w:bCs/>
+      <w:color w:val="000000"/>
+      <w:sz w:val="34"/>
+      <w:szCs w:val="34"/>
+    </w:rPr>
+  </w:style>
+  <w:style w:type="paragraph" w:styleId="Heading2">
+    <w:name w:val="Heading 2"/>
+    <w:basedOn w:val="Normal"/>
+    <w:next w:val="Normal"/>
+    <w:qFormat/>
+    <w:pPr>
+      <w:spacing w:after="160" w:before="240"/>
+    </w:pPr>
+    <w:rPr>
+      <w:rFonts w:ascii="Simplified Arabic" w:cs="Simplified Arabic" w:eastAsia="Simplified Arabic" w:hAnsi="Simplified Arabic"/>
+      <w:b/>
+      <w:bCs/>
+      <w:color w:val="000000"/>
+      <w:sz w:val="30"/>
+      <w:szCs w:val="30"/>
+    </w:rPr>
+  </w:style>
+  <w:style w:type="paragraph" w:styleId="Heading3">
+    <w:name w:val="Heading 3"/>
+    <w:basedOn w:val="Normal"/>
+    <w:next w:val="Normal"/>
+    <w:qFormat/>
+    <w:pPr>
+      <w:spacing w:after="160" w:before="240"/>
+    </w:pPr>
+    <w:rPr>
+      <w:rFonts w:ascii="Simplified Arabic" w:cs="Simplified Arabic" w:eastAsia="Simplified Arabic" w:hAnsi="Simplified Arabic"/>
+      <w:b/>
+      <w:bCs/>
+      <w:color w:val="000000"/>
+      <w:sz w:val="28"/>
+      <w:szCs w:val="28"/>
+    </w:rPr>
+  </w:style>
 </w:styles>
 </file>
</xml_diff>